<commit_message>
W02 SAT: week source file with three exhibits, reasons for all 58 items and a four-item stretch page; paper and key rebuilt with Word files
Co-Authored-By: Claude Opus 5.5 <noreply@anthropic.com>
Claude-Session: https://claude.ai/code/session_01RJaW3TsSXk1EJvejTDP7dk
</commit_message>
<xml_diff>
--- a/content/W02/SAT/paper/C2_W02_SAT_recap_paper_STUDENT.docx
+++ b/content/W02/SAT/paper/C2_W02_SAT_recap_paper_STUDENT.docx
@@ -7142,6 +7142,68 @@
               <w:t xml:space="preserve">The warehouse holds 1,000 Q2 orders. 920 orders have one payment row. 50 orders have two payment rows, because the gateway retried and recorded the same payment a second time. 30 delivered orders have no payment row.</w:t>
             </w:r>
           </w:p>
+          <w:p>
+            <w:pPr>
+              <w:spacing w:after="60" w:before="60"/>
+              <w:jc w:val="center"/>
+            </w:pPr>
+            <w:r>
+              <w:drawing>
+                <wp:inline distT="0" distB="0" distL="0" distR="0">
+                  <wp:extent cx="5372100" cy="1476375"/>
+                  <wp:effectExtent t="0" r="0" b="0" l="0"/>
+                  <wp:docPr id="1" name="" descr="" title=""/>
+                  <wp:cNvGraphicFramePr>
+                    <a:graphicFrameLocks xmlns:a="http://schemas.openxmlformats.org/drawingml/2006/main" noChangeAspect="1"/>
+                  </wp:cNvGraphicFramePr>
+                  <a:graphic xmlns:a="http://schemas.openxmlformats.org/drawingml/2006/main">
+                    <a:graphicData uri="http://schemas.openxmlformats.org/drawingml/2006/picture">
+                      <pic:pic xmlns:pic="http://schemas.openxmlformats.org/drawingml/2006/picture">
+                        <pic:nvPicPr>
+                          <pic:cNvPr id="0" name="" descr=""/>
+                          <pic:cNvPicPr>
+                            <a:picLocks noChangeAspect="1" noChangeArrowheads="1"/>
+                          </pic:cNvPicPr>
+                        </pic:nvPicPr>
+                        <pic:blipFill>
+                          <a:blip r:embed="rId9" cstate="none"/>
+                          <a:srcRect/>
+                          <a:stretch>
+                            <a:fillRect/>
+                          </a:stretch>
+                        </pic:blipFill>
+                        <pic:spPr bwMode="auto">
+                          <a:xfrm>
+                            <a:off x="0" y="0"/>
+                            <a:ext cx="5372100" cy="1476375"/>
+                          </a:xfrm>
+                          <a:prstGeom prst="rect">
+                            <a:avLst/>
+                          </a:prstGeom>
+                        </pic:spPr>
+                      </pic:pic>
+                    </a:graphicData>
+                  </a:graphic>
+                </wp:inline>
+              </w:drawing>
+            </w:r>
+          </w:p>
+          <w:p>
+            <w:pPr>
+              <w:spacing w:after="80"/>
+              <w:jc w:val="center"/>
+            </w:pPr>
+            <w:r>
+              <w:rPr>
+                <w:i/>
+                <w:iCs/>
+                <w:color w:val="6B6690"/>
+                <w:sz w:val="18"/>
+                <w:szCs w:val="18"/>
+              </w:rPr>
+              <w:t xml:space="preserve">The orders and their payment rows, as the situation describes them.</w:t>
+            </w:r>
+          </w:p>
         </w:tc>
       </w:tr>
     </w:tbl>
@@ -7665,6 +7727,500 @@
               <w:t xml:space="preserve">Q2 revenue in Rs thousand for six Retail-Plus members: A 900, B 850, C 850, D 700, E 700, F 650. Ranks run from the highest revenue down.</w:t>
             </w:r>
           </w:p>
+          <w:tbl>
+            <w:tblPr>
+              <w:tblW w:type="dxa" w:w="9526"/>
+              <w:tblBorders>
+                <w:top w:val="single" w:color="auto" w:sz="4"/>
+                <w:left w:val="single" w:color="auto" w:sz="4"/>
+                <w:bottom w:val="single" w:color="auto" w:sz="4"/>
+                <w:right w:val="single" w:color="auto" w:sz="4"/>
+                <w:insideH w:val="single" w:color="auto" w:sz="4"/>
+                <w:insideV w:val="single" w:color="auto" w:sz="4"/>
+              </w:tblBorders>
+            </w:tblPr>
+            <w:tblGrid>
+              <w:gridCol w:w="4763"/>
+              <w:gridCol w:w="4763"/>
+            </w:tblGrid>
+            <w:tr>
+              <w:trPr>
+                <w:tblHeader/>
+              </w:trPr>
+              <w:tc>
+                <w:tcPr>
+                  <w:tcW w:type="dxa" w:w="4763"/>
+                  <w:tcBorders>
+                    <w:top w:val="single" w:color="1A0F5C" w:sz="6"/>
+                    <w:left w:val="single" w:color="1A0F5C" w:sz="6"/>
+                    <w:bottom w:val="single" w:color="1A0F5C" w:sz="6"/>
+                    <w:right w:val="single" w:color="1A0F5C" w:sz="6"/>
+                  </w:tcBorders>
+                  <w:shd w:fill="1A0F5C" w:color="auto" w:val="clear"/>
+                  <w:tcMar>
+                    <w:top w:type="dxa" w:w="90"/>
+                    <w:left w:type="dxa" w:w="140"/>
+                    <w:bottom w:type="dxa" w:w="90"/>
+                    <w:right w:type="dxa" w:w="140"/>
+                  </w:tcMar>
+                </w:tcPr>
+                <w:p>
+                  <w:pPr>
+                    <w:spacing w:after="80"/>
+                  </w:pPr>
+                  <w:r>
+                    <w:rPr>
+                      <w:b/>
+                      <w:bCs/>
+                      <w:color w:val="FFFFFF"/>
+                      <w:sz w:val="18"/>
+                      <w:szCs w:val="18"/>
+                    </w:rPr>
+                    <w:t xml:space="preserve">Member</w:t>
+                  </w:r>
+                </w:p>
+              </w:tc>
+              <w:tc>
+                <w:tcPr>
+                  <w:tcW w:type="dxa" w:w="4763"/>
+                  <w:tcBorders>
+                    <w:top w:val="single" w:color="1A0F5C" w:sz="6"/>
+                    <w:left w:val="single" w:color="1A0F5C" w:sz="6"/>
+                    <w:bottom w:val="single" w:color="1A0F5C" w:sz="6"/>
+                    <w:right w:val="single" w:color="1A0F5C" w:sz="6"/>
+                  </w:tcBorders>
+                  <w:shd w:fill="1A0F5C" w:color="auto" w:val="clear"/>
+                  <w:tcMar>
+                    <w:top w:type="dxa" w:w="90"/>
+                    <w:left w:type="dxa" w:w="140"/>
+                    <w:bottom w:type="dxa" w:w="90"/>
+                    <w:right w:type="dxa" w:w="140"/>
+                  </w:tcMar>
+                </w:tcPr>
+                <w:p>
+                  <w:pPr>
+                    <w:spacing w:after="80"/>
+                  </w:pPr>
+                  <w:r>
+                    <w:rPr>
+                      <w:b/>
+                      <w:bCs/>
+                      <w:color w:val="FFFFFF"/>
+                      <w:sz w:val="18"/>
+                      <w:szCs w:val="18"/>
+                    </w:rPr>
+                    <w:t xml:space="preserve">Q2 revenue, Rs thousand</w:t>
+                  </w:r>
+                </w:p>
+              </w:tc>
+            </w:tr>
+            <w:tr>
+              <w:tc>
+                <w:tcPr>
+                  <w:tcW w:type="dxa" w:w="4763"/>
+                  <w:tcBorders>
+                    <w:top w:val="single" w:color="CFC9EE" w:sz="6"/>
+                    <w:left w:val="single" w:color="CFC9EE" w:sz="6"/>
+                    <w:bottom w:val="single" w:color="CFC9EE" w:sz="6"/>
+                    <w:right w:val="single" w:color="CFC9EE" w:sz="6"/>
+                  </w:tcBorders>
+                  <w:tcMar>
+                    <w:top w:type="dxa" w:w="90"/>
+                    <w:left w:type="dxa" w:w="140"/>
+                    <w:bottom w:type="dxa" w:w="90"/>
+                    <w:right w:type="dxa" w:w="140"/>
+                  </w:tcMar>
+                </w:tcPr>
+                <w:p>
+                  <w:pPr>
+                    <w:spacing w:after="80"/>
+                  </w:pPr>
+                  <w:r>
+                    <w:rPr>
+                      <w:color w:val="1A0F5C"/>
+                      <w:sz w:val="18"/>
+                      <w:szCs w:val="18"/>
+                    </w:rPr>
+                    <w:t xml:space="preserve">A</w:t>
+                  </w:r>
+                </w:p>
+              </w:tc>
+              <w:tc>
+                <w:tcPr>
+                  <w:tcW w:type="dxa" w:w="4763"/>
+                  <w:tcBorders>
+                    <w:top w:val="single" w:color="CFC9EE" w:sz="6"/>
+                    <w:left w:val="single" w:color="CFC9EE" w:sz="6"/>
+                    <w:bottom w:val="single" w:color="CFC9EE" w:sz="6"/>
+                    <w:right w:val="single" w:color="CFC9EE" w:sz="6"/>
+                  </w:tcBorders>
+                  <w:tcMar>
+                    <w:top w:type="dxa" w:w="90"/>
+                    <w:left w:type="dxa" w:w="140"/>
+                    <w:bottom w:type="dxa" w:w="90"/>
+                    <w:right w:type="dxa" w:w="140"/>
+                  </w:tcMar>
+                </w:tcPr>
+                <w:p>
+                  <w:pPr>
+                    <w:spacing w:after="80"/>
+                  </w:pPr>
+                  <w:r>
+                    <w:rPr>
+                      <w:b w:val="false"/>
+                      <w:bCs w:val="false"/>
+                      <w:color w:val="1A0F5C"/>
+                      <w:sz w:val="18"/>
+                      <w:szCs w:val="18"/>
+                    </w:rPr>
+                    <w:t xml:space="preserve">900</w:t>
+                  </w:r>
+                </w:p>
+              </w:tc>
+            </w:tr>
+            <w:tr>
+              <w:tc>
+                <w:tcPr>
+                  <w:tcW w:type="dxa" w:w="4763"/>
+                  <w:tcBorders>
+                    <w:top w:val="single" w:color="CFC9EE" w:sz="6"/>
+                    <w:left w:val="single" w:color="CFC9EE" w:sz="6"/>
+                    <w:bottom w:val="single" w:color="CFC9EE" w:sz="6"/>
+                    <w:right w:val="single" w:color="CFC9EE" w:sz="6"/>
+                  </w:tcBorders>
+                  <w:shd w:fill="F4F2FA" w:color="auto" w:val="clear"/>
+                  <w:tcMar>
+                    <w:top w:type="dxa" w:w="90"/>
+                    <w:left w:type="dxa" w:w="140"/>
+                    <w:bottom w:type="dxa" w:w="90"/>
+                    <w:right w:type="dxa" w:w="140"/>
+                  </w:tcMar>
+                </w:tcPr>
+                <w:p>
+                  <w:pPr>
+                    <w:spacing w:after="80"/>
+                  </w:pPr>
+                  <w:r>
+                    <w:rPr>
+                      <w:color w:val="1A0F5C"/>
+                      <w:sz w:val="18"/>
+                      <w:szCs w:val="18"/>
+                    </w:rPr>
+                    <w:t xml:space="preserve">B</w:t>
+                  </w:r>
+                </w:p>
+              </w:tc>
+              <w:tc>
+                <w:tcPr>
+                  <w:tcW w:type="dxa" w:w="4763"/>
+                  <w:tcBorders>
+                    <w:top w:val="single" w:color="CFC9EE" w:sz="6"/>
+                    <w:left w:val="single" w:color="CFC9EE" w:sz="6"/>
+                    <w:bottom w:val="single" w:color="CFC9EE" w:sz="6"/>
+                    <w:right w:val="single" w:color="CFC9EE" w:sz="6"/>
+                  </w:tcBorders>
+                  <w:shd w:fill="F4F2FA" w:color="auto" w:val="clear"/>
+                  <w:tcMar>
+                    <w:top w:type="dxa" w:w="90"/>
+                    <w:left w:type="dxa" w:w="140"/>
+                    <w:bottom w:type="dxa" w:w="90"/>
+                    <w:right w:type="dxa" w:w="140"/>
+                  </w:tcMar>
+                </w:tcPr>
+                <w:p>
+                  <w:pPr>
+                    <w:spacing w:after="80"/>
+                  </w:pPr>
+                  <w:r>
+                    <w:rPr>
+                      <w:b w:val="false"/>
+                      <w:bCs w:val="false"/>
+                      <w:color w:val="1A0F5C"/>
+                      <w:sz w:val="18"/>
+                      <w:szCs w:val="18"/>
+                    </w:rPr>
+                    <w:t xml:space="preserve">850</w:t>
+                  </w:r>
+                </w:p>
+              </w:tc>
+            </w:tr>
+            <w:tr>
+              <w:tc>
+                <w:tcPr>
+                  <w:tcW w:type="dxa" w:w="4763"/>
+                  <w:tcBorders>
+                    <w:top w:val="single" w:color="CFC9EE" w:sz="6"/>
+                    <w:left w:val="single" w:color="CFC9EE" w:sz="6"/>
+                    <w:bottom w:val="single" w:color="CFC9EE" w:sz="6"/>
+                    <w:right w:val="single" w:color="CFC9EE" w:sz="6"/>
+                  </w:tcBorders>
+                  <w:tcMar>
+                    <w:top w:type="dxa" w:w="90"/>
+                    <w:left w:type="dxa" w:w="140"/>
+                    <w:bottom w:type="dxa" w:w="90"/>
+                    <w:right w:type="dxa" w:w="140"/>
+                  </w:tcMar>
+                </w:tcPr>
+                <w:p>
+                  <w:pPr>
+                    <w:spacing w:after="80"/>
+                  </w:pPr>
+                  <w:r>
+                    <w:rPr>
+                      <w:color w:val="1A0F5C"/>
+                      <w:sz w:val="18"/>
+                      <w:szCs w:val="18"/>
+                    </w:rPr>
+                    <w:t xml:space="preserve">C</w:t>
+                  </w:r>
+                </w:p>
+              </w:tc>
+              <w:tc>
+                <w:tcPr>
+                  <w:tcW w:type="dxa" w:w="4763"/>
+                  <w:tcBorders>
+                    <w:top w:val="single" w:color="CFC9EE" w:sz="6"/>
+                    <w:left w:val="single" w:color="CFC9EE" w:sz="6"/>
+                    <w:bottom w:val="single" w:color="CFC9EE" w:sz="6"/>
+                    <w:right w:val="single" w:color="CFC9EE" w:sz="6"/>
+                  </w:tcBorders>
+                  <w:tcMar>
+                    <w:top w:type="dxa" w:w="90"/>
+                    <w:left w:type="dxa" w:w="140"/>
+                    <w:bottom w:type="dxa" w:w="90"/>
+                    <w:right w:type="dxa" w:w="140"/>
+                  </w:tcMar>
+                </w:tcPr>
+                <w:p>
+                  <w:pPr>
+                    <w:spacing w:after="80"/>
+                  </w:pPr>
+                  <w:r>
+                    <w:rPr>
+                      <w:b w:val="false"/>
+                      <w:bCs w:val="false"/>
+                      <w:color w:val="1A0F5C"/>
+                      <w:sz w:val="18"/>
+                      <w:szCs w:val="18"/>
+                    </w:rPr>
+                    <w:t xml:space="preserve">850</w:t>
+                  </w:r>
+                </w:p>
+              </w:tc>
+            </w:tr>
+            <w:tr>
+              <w:tc>
+                <w:tcPr>
+                  <w:tcW w:type="dxa" w:w="4763"/>
+                  <w:tcBorders>
+                    <w:top w:val="single" w:color="CFC9EE" w:sz="6"/>
+                    <w:left w:val="single" w:color="CFC9EE" w:sz="6"/>
+                    <w:bottom w:val="single" w:color="CFC9EE" w:sz="6"/>
+                    <w:right w:val="single" w:color="CFC9EE" w:sz="6"/>
+                  </w:tcBorders>
+                  <w:shd w:fill="F4F2FA" w:color="auto" w:val="clear"/>
+                  <w:tcMar>
+                    <w:top w:type="dxa" w:w="90"/>
+                    <w:left w:type="dxa" w:w="140"/>
+                    <w:bottom w:type="dxa" w:w="90"/>
+                    <w:right w:type="dxa" w:w="140"/>
+                  </w:tcMar>
+                </w:tcPr>
+                <w:p>
+                  <w:pPr>
+                    <w:spacing w:after="80"/>
+                  </w:pPr>
+                  <w:r>
+                    <w:rPr>
+                      <w:color w:val="1A0F5C"/>
+                      <w:sz w:val="18"/>
+                      <w:szCs w:val="18"/>
+                    </w:rPr>
+                    <w:t xml:space="preserve">D</w:t>
+                  </w:r>
+                </w:p>
+              </w:tc>
+              <w:tc>
+                <w:tcPr>
+                  <w:tcW w:type="dxa" w:w="4763"/>
+                  <w:tcBorders>
+                    <w:top w:val="single" w:color="CFC9EE" w:sz="6"/>
+                    <w:left w:val="single" w:color="CFC9EE" w:sz="6"/>
+                    <w:bottom w:val="single" w:color="CFC9EE" w:sz="6"/>
+                    <w:right w:val="single" w:color="CFC9EE" w:sz="6"/>
+                  </w:tcBorders>
+                  <w:shd w:fill="F4F2FA" w:color="auto" w:val="clear"/>
+                  <w:tcMar>
+                    <w:top w:type="dxa" w:w="90"/>
+                    <w:left w:type="dxa" w:w="140"/>
+                    <w:bottom w:type="dxa" w:w="90"/>
+                    <w:right w:type="dxa" w:w="140"/>
+                  </w:tcMar>
+                </w:tcPr>
+                <w:p>
+                  <w:pPr>
+                    <w:spacing w:after="80"/>
+                  </w:pPr>
+                  <w:r>
+                    <w:rPr>
+                      <w:b w:val="false"/>
+                      <w:bCs w:val="false"/>
+                      <w:color w:val="1A0F5C"/>
+                      <w:sz w:val="18"/>
+                      <w:szCs w:val="18"/>
+                    </w:rPr>
+                    <w:t xml:space="preserve">700</w:t>
+                  </w:r>
+                </w:p>
+              </w:tc>
+            </w:tr>
+            <w:tr>
+              <w:tc>
+                <w:tcPr>
+                  <w:tcW w:type="dxa" w:w="4763"/>
+                  <w:tcBorders>
+                    <w:top w:val="single" w:color="CFC9EE" w:sz="6"/>
+                    <w:left w:val="single" w:color="CFC9EE" w:sz="6"/>
+                    <w:bottom w:val="single" w:color="CFC9EE" w:sz="6"/>
+                    <w:right w:val="single" w:color="CFC9EE" w:sz="6"/>
+                  </w:tcBorders>
+                  <w:tcMar>
+                    <w:top w:type="dxa" w:w="90"/>
+                    <w:left w:type="dxa" w:w="140"/>
+                    <w:bottom w:type="dxa" w:w="90"/>
+                    <w:right w:type="dxa" w:w="140"/>
+                  </w:tcMar>
+                </w:tcPr>
+                <w:p>
+                  <w:pPr>
+                    <w:spacing w:after="80"/>
+                  </w:pPr>
+                  <w:r>
+                    <w:rPr>
+                      <w:color w:val="1A0F5C"/>
+                      <w:sz w:val="18"/>
+                      <w:szCs w:val="18"/>
+                    </w:rPr>
+                    <w:t xml:space="preserve">E</w:t>
+                  </w:r>
+                </w:p>
+              </w:tc>
+              <w:tc>
+                <w:tcPr>
+                  <w:tcW w:type="dxa" w:w="4763"/>
+                  <w:tcBorders>
+                    <w:top w:val="single" w:color="CFC9EE" w:sz="6"/>
+                    <w:left w:val="single" w:color="CFC9EE" w:sz="6"/>
+                    <w:bottom w:val="single" w:color="CFC9EE" w:sz="6"/>
+                    <w:right w:val="single" w:color="CFC9EE" w:sz="6"/>
+                  </w:tcBorders>
+                  <w:tcMar>
+                    <w:top w:type="dxa" w:w="90"/>
+                    <w:left w:type="dxa" w:w="140"/>
+                    <w:bottom w:type="dxa" w:w="90"/>
+                    <w:right w:type="dxa" w:w="140"/>
+                  </w:tcMar>
+                </w:tcPr>
+                <w:p>
+                  <w:pPr>
+                    <w:spacing w:after="80"/>
+                  </w:pPr>
+                  <w:r>
+                    <w:rPr>
+                      <w:b w:val="false"/>
+                      <w:bCs w:val="false"/>
+                      <w:color w:val="1A0F5C"/>
+                      <w:sz w:val="18"/>
+                      <w:szCs w:val="18"/>
+                    </w:rPr>
+                    <w:t xml:space="preserve">700</w:t>
+                  </w:r>
+                </w:p>
+              </w:tc>
+            </w:tr>
+            <w:tr>
+              <w:tc>
+                <w:tcPr>
+                  <w:tcW w:type="dxa" w:w="4763"/>
+                  <w:tcBorders>
+                    <w:top w:val="single" w:color="CFC9EE" w:sz="6"/>
+                    <w:left w:val="single" w:color="CFC9EE" w:sz="6"/>
+                    <w:bottom w:val="single" w:color="CFC9EE" w:sz="6"/>
+                    <w:right w:val="single" w:color="CFC9EE" w:sz="6"/>
+                  </w:tcBorders>
+                  <w:shd w:fill="F4F2FA" w:color="auto" w:val="clear"/>
+                  <w:tcMar>
+                    <w:top w:type="dxa" w:w="90"/>
+                    <w:left w:type="dxa" w:w="140"/>
+                    <w:bottom w:type="dxa" w:w="90"/>
+                    <w:right w:type="dxa" w:w="140"/>
+                  </w:tcMar>
+                </w:tcPr>
+                <w:p>
+                  <w:pPr>
+                    <w:spacing w:after="80"/>
+                  </w:pPr>
+                  <w:r>
+                    <w:rPr>
+                      <w:color w:val="1A0F5C"/>
+                      <w:sz w:val="18"/>
+                      <w:szCs w:val="18"/>
+                    </w:rPr>
+                    <w:t xml:space="preserve">F</w:t>
+                  </w:r>
+                </w:p>
+              </w:tc>
+              <w:tc>
+                <w:tcPr>
+                  <w:tcW w:type="dxa" w:w="4763"/>
+                  <w:tcBorders>
+                    <w:top w:val="single" w:color="CFC9EE" w:sz="6"/>
+                    <w:left w:val="single" w:color="CFC9EE" w:sz="6"/>
+                    <w:bottom w:val="single" w:color="CFC9EE" w:sz="6"/>
+                    <w:right w:val="single" w:color="CFC9EE" w:sz="6"/>
+                  </w:tcBorders>
+                  <w:shd w:fill="F4F2FA" w:color="auto" w:val="clear"/>
+                  <w:tcMar>
+                    <w:top w:type="dxa" w:w="90"/>
+                    <w:left w:type="dxa" w:w="140"/>
+                    <w:bottom w:type="dxa" w:w="90"/>
+                    <w:right w:type="dxa" w:w="140"/>
+                  </w:tcMar>
+                </w:tcPr>
+                <w:p>
+                  <w:pPr>
+                    <w:spacing w:after="80"/>
+                  </w:pPr>
+                  <w:r>
+                    <w:rPr>
+                      <w:b w:val="false"/>
+                      <w:bCs w:val="false"/>
+                      <w:color w:val="1A0F5C"/>
+                      <w:sz w:val="18"/>
+                      <w:szCs w:val="18"/>
+                    </w:rPr>
+                    <w:t xml:space="preserve">650</w:t>
+                  </w:r>
+                </w:p>
+              </w:tc>
+            </w:tr>
+          </w:tbl>
+          <w:p>
+            <w:pPr>
+              <w:spacing w:after="80"/>
+              <w:jc w:val="center"/>
+            </w:pPr>
+            <w:r>
+              <w:rPr>
+                <w:i/>
+                <w:iCs/>
+                <w:color w:val="6B6690"/>
+                <w:sz w:val="18"/>
+                <w:szCs w:val="18"/>
+              </w:rPr>
+              <w:t xml:space="preserve">The six members, highest revenue first.</w:t>
+            </w:r>
+          </w:p>
         </w:tc>
       </w:tr>
     </w:tbl>
@@ -8269,6 +8825,68 @@
                 <w:szCs w:val="21"/>
               </w:rPr>
               <w:t xml:space="preserve">Marketing's customer table has 1,000 rows. The campaign exposure table lists the same 1,000 customers, and 60 of them appear twice. An analyst merges the two on customer_id with how='left' and sends the result to Excel, where a pivot sums revenue.</w:t>
+            </w:r>
+          </w:p>
+          <w:p>
+            <w:pPr>
+              <w:spacing w:after="60" w:before="60"/>
+              <w:jc w:val="center"/>
+            </w:pPr>
+            <w:r>
+              <w:drawing>
+                <wp:inline distT="0" distB="0" distL="0" distR="0">
+                  <wp:extent cx="5286375" cy="1362075"/>
+                  <wp:effectExtent t="0" r="0" b="0" l="0"/>
+                  <wp:docPr id="1" name="" descr="" title=""/>
+                  <wp:cNvGraphicFramePr>
+                    <a:graphicFrameLocks xmlns:a="http://schemas.openxmlformats.org/drawingml/2006/main" noChangeAspect="1"/>
+                  </wp:cNvGraphicFramePr>
+                  <a:graphic xmlns:a="http://schemas.openxmlformats.org/drawingml/2006/main">
+                    <a:graphicData uri="http://schemas.openxmlformats.org/drawingml/2006/picture">
+                      <pic:pic xmlns:pic="http://schemas.openxmlformats.org/drawingml/2006/picture">
+                        <pic:nvPicPr>
+                          <pic:cNvPr id="0" name="" descr=""/>
+                          <pic:cNvPicPr>
+                            <a:picLocks noChangeAspect="1" noChangeArrowheads="1"/>
+                          </pic:cNvPicPr>
+                        </pic:nvPicPr>
+                        <pic:blipFill>
+                          <a:blip r:embed="rId10" cstate="none"/>
+                          <a:srcRect/>
+                          <a:stretch>
+                            <a:fillRect/>
+                          </a:stretch>
+                        </pic:blipFill>
+                        <pic:spPr bwMode="auto">
+                          <a:xfrm>
+                            <a:off x="0" y="0"/>
+                            <a:ext cx="5286375" cy="1362075"/>
+                          </a:xfrm>
+                          <a:prstGeom prst="rect">
+                            <a:avLst/>
+                          </a:prstGeom>
+                        </pic:spPr>
+                      </pic:pic>
+                    </a:graphicData>
+                  </a:graphic>
+                </wp:inline>
+              </w:drawing>
+            </w:r>
+          </w:p>
+          <w:p>
+            <w:pPr>
+              <w:spacing w:after="80"/>
+              <w:jc w:val="center"/>
+            </w:pPr>
+            <w:r>
+              <w:rPr>
+                <w:i/>
+                <w:iCs/>
+                <w:color w:val="6B6690"/>
+                <w:sz w:val="18"/>
+                <w:szCs w:val="18"/>
+              </w:rPr>
+              <w:t xml:space="preserve">The analyst's path from two tables to the pivot.</w:t>
             </w:r>
           </w:p>
         </w:tc>
@@ -9792,6 +10410,374 @@
                 <w:szCs w:val="21"/>
               </w:rPr>
               <w:t xml:space="preserve">Order:  ______________________________</w:t>
+            </w:r>
+          </w:p>
+        </w:tc>
+      </w:tr>
+    </w:tbl>
+    <w:p>
+      <w:pPr>
+        <w:spacing w:after="100"/>
+      </w:pPr>
+    </w:p>
+    <w:p>
+      <w:r>
+        <w:br w:type="page"/>
+      </w:r>
+    </w:p>
+    <w:p>
+      <w:pPr>
+        <w:spacing w:after="100" w:before="0"/>
+      </w:pPr>
+      <w:r>
+        <w:rPr>
+          <w:rFonts w:ascii="Georgia" w:cs="Georgia" w:eastAsia="Georgia" w:hAnsi="Georgia"/>
+          <w:color w:val="1A0F5C"/>
+          <w:sz w:val="30"/>
+          <w:szCs w:val="30"/>
+        </w:rPr>
+        <w:t xml:space="preserve">Stretch: untimed, and not marked</w:t>
+      </w:r>
+    </w:p>
+    <w:p>
+      <w:pPr>
+        <w:spacing w:after="160"/>
+      </w:pPr>
+      <w:r>
+        <w:rPr>
+          <w:color w:val="6B6690"/>
+          <w:sz w:val="21"/>
+          <w:szCs w:val="21"/>
+        </w:rPr>
+        <w:t xml:space="preserve">For anyone who finishes early. Nothing here is counted; each item is the kind an interviewer asks after your first answer, so write the answer you would say.</w:t>
+      </w:r>
+    </w:p>
+    <w:tbl>
+      <w:tblPr>
+        <w:tblW w:type="dxa" w:w="9806"/>
+        <w:tblBorders>
+          <w:top w:val="single" w:color="auto" w:sz="4"/>
+          <w:left w:val="single" w:color="auto" w:sz="4"/>
+          <w:bottom w:val="single" w:color="auto" w:sz="4"/>
+          <w:right w:val="single" w:color="auto" w:sz="4"/>
+          <w:insideH w:val="single" w:color="auto" w:sz="4"/>
+          <w:insideV w:val="single" w:color="auto" w:sz="4"/>
+        </w:tblBorders>
+      </w:tblPr>
+      <w:tblGrid>
+        <w:gridCol w:w="9806"/>
+      </w:tblGrid>
+      <w:tr>
+        <w:trPr>
+          <w:cantSplit/>
+        </w:trPr>
+        <w:tc>
+          <w:tcPr>
+            <w:tcW w:type="dxa" w:w="9806"/>
+            <w:tcBorders>
+              <w:top w:val="single" w:color="CFC9EE" w:sz="6"/>
+              <w:left w:val="single" w:color="CFC9EE" w:sz="6"/>
+              <w:bottom w:val="single" w:color="CFC9EE" w:sz="6"/>
+              <w:right w:val="single" w:color="CFC9EE" w:sz="6"/>
+            </w:tcBorders>
+            <w:tcMar>
+              <w:top w:type="dxa" w:w="90"/>
+              <w:left w:type="dxa" w:w="140"/>
+              <w:bottom w:type="dxa" w:w="90"/>
+              <w:right w:type="dxa" w:w="140"/>
+            </w:tcMar>
+          </w:tcPr>
+          <w:p>
+            <w:pPr>
+              <w:spacing w:after="80"/>
+            </w:pPr>
+            <w:r>
+              <w:rPr>
+                <w:b/>
+                <w:bCs/>
+                <w:color w:val="5B3FD6"/>
+                <w:sz w:val="22"/>
+                <w:szCs w:val="22"/>
+              </w:rPr>
+              <w:t xml:space="preserve">Stretch 1</w:t>
+            </w:r>
+          </w:p>
+          <w:p>
+            <w:pPr>
+              <w:spacing w:after="80"/>
+            </w:pPr>
+            <w:r>
+              <w:rPr>
+                <w:color w:val="1A0F5C"/>
+                <w:sz w:val="21"/>
+                <w:szCs w:val="21"/>
+              </w:rPr>
+              <w:t xml:space="preserve">COUNT(*) / COUNT(DISTINCT customer_id) over 1,000 orders and 400 customers puts 2 orders per customer in the Monday report. What went wrong, what is the right number, and how do you write it?</w:t>
+            </w:r>
+          </w:p>
+          <w:p>
+            <w:pPr>
+              <w:spacing w:after="1400"/>
+            </w:pPr>
+            <w:r>
+              <w:rPr>
+                <w:color w:val="1A0F5C"/>
+                <w:sz w:val="21"/>
+                <w:szCs w:val="21"/>
+              </w:rPr>
+              <w:t xml:space="preserve"/>
+            </w:r>
+          </w:p>
+        </w:tc>
+      </w:tr>
+    </w:tbl>
+    <w:p>
+      <w:pPr>
+        <w:spacing w:after="100"/>
+      </w:pPr>
+    </w:p>
+    <w:tbl>
+      <w:tblPr>
+        <w:tblW w:type="dxa" w:w="9806"/>
+        <w:tblBorders>
+          <w:top w:val="single" w:color="auto" w:sz="4"/>
+          <w:left w:val="single" w:color="auto" w:sz="4"/>
+          <w:bottom w:val="single" w:color="auto" w:sz="4"/>
+          <w:right w:val="single" w:color="auto" w:sz="4"/>
+          <w:insideH w:val="single" w:color="auto" w:sz="4"/>
+          <w:insideV w:val="single" w:color="auto" w:sz="4"/>
+        </w:tblBorders>
+      </w:tblPr>
+      <w:tblGrid>
+        <w:gridCol w:w="9806"/>
+      </w:tblGrid>
+      <w:tr>
+        <w:trPr>
+          <w:cantSplit/>
+        </w:trPr>
+        <w:tc>
+          <w:tcPr>
+            <w:tcW w:type="dxa" w:w="9806"/>
+            <w:tcBorders>
+              <w:top w:val="single" w:color="CFC9EE" w:sz="6"/>
+              <w:left w:val="single" w:color="CFC9EE" w:sz="6"/>
+              <w:bottom w:val="single" w:color="CFC9EE" w:sz="6"/>
+              <w:right w:val="single" w:color="CFC9EE" w:sz="6"/>
+            </w:tcBorders>
+            <w:tcMar>
+              <w:top w:type="dxa" w:w="90"/>
+              <w:left w:type="dxa" w:w="140"/>
+              <w:bottom w:type="dxa" w:w="90"/>
+              <w:right w:type="dxa" w:w="140"/>
+            </w:tcMar>
+          </w:tcPr>
+          <w:p>
+            <w:pPr>
+              <w:spacing w:after="80"/>
+            </w:pPr>
+            <w:r>
+              <w:rPr>
+                <w:b/>
+                <w:bCs/>
+                <w:color w:val="5B3FD6"/>
+                <w:sz w:val="22"/>
+                <w:szCs w:val="22"/>
+              </w:rPr>
+              <w:t xml:space="preserve">Stretch 2</w:t>
+            </w:r>
+          </w:p>
+          <w:p>
+            <w:pPr>
+              <w:spacing w:after="80"/>
+            </w:pPr>
+            <w:r>
+              <w:rPr>
+                <w:color w:val="1A0F5C"/>
+                <w:sz w:val="21"/>
+                <w:szCs w:val="21"/>
+              </w:rPr>
+              <w:t xml:space="preserve">Orders LEFT JOIN payments with WHERE payments.amount_paid &gt; 0 loses the 30 unpaid orders out of 1,000. Why, where does the condition belong, and what else do you check before Finance sees the total?</w:t>
+            </w:r>
+          </w:p>
+          <w:p>
+            <w:pPr>
+              <w:spacing w:after="1400"/>
+            </w:pPr>
+            <w:r>
+              <w:rPr>
+                <w:color w:val="1A0F5C"/>
+                <w:sz w:val="21"/>
+                <w:szCs w:val="21"/>
+              </w:rPr>
+              <w:t xml:space="preserve"/>
+            </w:r>
+          </w:p>
+        </w:tc>
+      </w:tr>
+    </w:tbl>
+    <w:p>
+      <w:pPr>
+        <w:spacing w:after="100"/>
+      </w:pPr>
+    </w:p>
+    <w:tbl>
+      <w:tblPr>
+        <w:tblW w:type="dxa" w:w="9806"/>
+        <w:tblBorders>
+          <w:top w:val="single" w:color="auto" w:sz="4"/>
+          <w:left w:val="single" w:color="auto" w:sz="4"/>
+          <w:bottom w:val="single" w:color="auto" w:sz="4"/>
+          <w:right w:val="single" w:color="auto" w:sz="4"/>
+          <w:insideH w:val="single" w:color="auto" w:sz="4"/>
+          <w:insideV w:val="single" w:color="auto" w:sz="4"/>
+        </w:tblBorders>
+      </w:tblPr>
+      <w:tblGrid>
+        <w:gridCol w:w="9806"/>
+      </w:tblGrid>
+      <w:tr>
+        <w:trPr>
+          <w:cantSplit/>
+        </w:trPr>
+        <w:tc>
+          <w:tcPr>
+            <w:tcW w:type="dxa" w:w="9806"/>
+            <w:tcBorders>
+              <w:top w:val="single" w:color="CFC9EE" w:sz="6"/>
+              <w:left w:val="single" w:color="CFC9EE" w:sz="6"/>
+              <w:bottom w:val="single" w:color="CFC9EE" w:sz="6"/>
+              <w:right w:val="single" w:color="CFC9EE" w:sz="6"/>
+            </w:tcBorders>
+            <w:tcMar>
+              <w:top w:type="dxa" w:w="90"/>
+              <w:left w:type="dxa" w:w="140"/>
+              <w:bottom w:type="dxa" w:w="90"/>
+              <w:right w:type="dxa" w:w="140"/>
+            </w:tcMar>
+          </w:tcPr>
+          <w:p>
+            <w:pPr>
+              <w:spacing w:after="80"/>
+            </w:pPr>
+            <w:r>
+              <w:rPr>
+                <w:b/>
+                <w:bCs/>
+                <w:color w:val="5B3FD6"/>
+                <w:sz w:val="22"/>
+                <w:szCs w:val="22"/>
+              </w:rPr>
+              <w:t xml:space="preserve">Stretch 3</w:t>
+            </w:r>
+          </w:p>
+          <w:p>
+            <w:pPr>
+              <w:spacing w:after="80"/>
+            </w:pPr>
+            <w:r>
+              <w:rPr>
+                <w:color w:val="1A0F5C"/>
+                <w:sz w:val="21"/>
+                <w:szCs w:val="21"/>
+              </w:rPr>
+              <w:t xml:space="preserve">A top-fifty list built with RANK returns 51 names on a tie at fifty. The segment head says ties rank the same; Finance says the list is fifty. What do you ship, and what do you say?</w:t>
+            </w:r>
+          </w:p>
+          <w:p>
+            <w:pPr>
+              <w:spacing w:after="1400"/>
+            </w:pPr>
+            <w:r>
+              <w:rPr>
+                <w:color w:val="1A0F5C"/>
+                <w:sz w:val="21"/>
+                <w:szCs w:val="21"/>
+              </w:rPr>
+              <w:t xml:space="preserve"/>
+            </w:r>
+          </w:p>
+        </w:tc>
+      </w:tr>
+    </w:tbl>
+    <w:p>
+      <w:pPr>
+        <w:spacing w:after="100"/>
+      </w:pPr>
+    </w:p>
+    <w:tbl>
+      <w:tblPr>
+        <w:tblW w:type="dxa" w:w="9806"/>
+        <w:tblBorders>
+          <w:top w:val="single" w:color="auto" w:sz="4"/>
+          <w:left w:val="single" w:color="auto" w:sz="4"/>
+          <w:bottom w:val="single" w:color="auto" w:sz="4"/>
+          <w:right w:val="single" w:color="auto" w:sz="4"/>
+          <w:insideH w:val="single" w:color="auto" w:sz="4"/>
+          <w:insideV w:val="single" w:color="auto" w:sz="4"/>
+        </w:tblBorders>
+      </w:tblPr>
+      <w:tblGrid>
+        <w:gridCol w:w="9806"/>
+      </w:tblGrid>
+      <w:tr>
+        <w:trPr>
+          <w:cantSplit/>
+        </w:trPr>
+        <w:tc>
+          <w:tcPr>
+            <w:tcW w:type="dxa" w:w="9806"/>
+            <w:tcBorders>
+              <w:top w:val="single" w:color="CFC9EE" w:sz="6"/>
+              <w:left w:val="single" w:color="CFC9EE" w:sz="6"/>
+              <w:bottom w:val="single" w:color="CFC9EE" w:sz="6"/>
+              <w:right w:val="single" w:color="CFC9EE" w:sz="6"/>
+            </w:tcBorders>
+            <w:tcMar>
+              <w:top w:type="dxa" w:w="90"/>
+              <w:left w:type="dxa" w:w="140"/>
+              <w:bottom w:type="dxa" w:w="90"/>
+              <w:right w:type="dxa" w:w="140"/>
+            </w:tcMar>
+          </w:tcPr>
+          <w:p>
+            <w:pPr>
+              <w:spacing w:after="80"/>
+            </w:pPr>
+            <w:r>
+              <w:rPr>
+                <w:b/>
+                <w:bCs/>
+                <w:color w:val="5B3FD6"/>
+                <w:sz w:val="22"/>
+                <w:szCs w:val="22"/>
+              </w:rPr>
+              <w:t xml:space="preserve">Stretch 4</w:t>
+            </w:r>
+          </w:p>
+          <w:p>
+            <w:pPr>
+              <w:spacing w:after="80"/>
+            </w:pPr>
+            <w:r>
+              <w:rPr>
+                <w:color w:val="1A0F5C"/>
+                <w:sz w:val="21"/>
+                <w:szCs w:val="21"/>
+              </w:rPr>
+              <w:t xml:space="preserve">A pandas pivot_table of revenue by segment sits far below the warehouse, and an Excel lookup shows details for an id that is in no table. Name the setting behind each, and the fix.</w:t>
+            </w:r>
+          </w:p>
+          <w:p>
+            <w:pPr>
+              <w:spacing w:after="1400"/>
+            </w:pPr>
+            <w:r>
+              <w:rPr>
+                <w:color w:val="1A0F5C"/>
+                <w:sz w:val="21"/>
+                <w:szCs w:val="21"/>
+              </w:rPr>
+              <w:t xml:space="preserve"/>
             </w:r>
           </w:p>
         </w:tc>

</xml_diff>

<commit_message>
W02 Saturday: Q52 asks what the query returns and how it reads, rebuilt on the merged builder
Q52's options now say how each result reads, so the key describes the query's
message without asserting that spend per member held flat, which the key's
reasons show is false once the members with no Q2 order count as zero. The paper
and key are rebuilt on the builder that keeps exhibits with their questions, and
the Weeks 1 and 2 spine records the re-cut.

Co-Authored-By: Claude Opus 5.5 <noreply@anthropic.com>
Claude-Session: https://claude.ai/code/session_01P7zaoR4dQ5pzBFnsX549JQ
</commit_message>
<xml_diff>
--- a/content/W02/SAT/paper/C2_W02_SAT_recap_paper_STUDENT.docx
+++ b/content/W02/SAT/paper/C2_W02_SAT_recap_paper_STUDENT.docx
@@ -18,6 +18,7 @@
     </w:p>
     <w:p>
       <w:pPr>
+        <w:keepNext w:val="false"/>
         <w:spacing w:after="200"/>
       </w:pPr>
       <w:r>
@@ -45,6 +46,7 @@
     </w:p>
     <w:p>
       <w:pPr>
+        <w:keepNext w:val="false"/>
         <w:spacing w:after="80"/>
       </w:pPr>
       <w:r>
@@ -109,6 +111,7 @@
           </w:tcPr>
           <w:p>
             <w:pPr>
+              <w:keepNext w:val="false"/>
               <w:spacing w:after="80"/>
             </w:pPr>
             <w:r>
@@ -142,6 +145,7 @@
           </w:tcPr>
           <w:p>
             <w:pPr>
+              <w:keepNext w:val="false"/>
               <w:spacing w:after="80"/>
             </w:pPr>
             <w:r>
@@ -176,6 +180,7 @@
           </w:tcPr>
           <w:p>
             <w:pPr>
+              <w:keepNext w:val="false"/>
               <w:spacing w:after="80"/>
             </w:pPr>
             <w:r>
@@ -208,6 +213,7 @@
           </w:tcPr>
           <w:p>
             <w:pPr>
+              <w:keepNext w:val="false"/>
               <w:spacing w:after="80"/>
             </w:pPr>
             <w:r>
@@ -241,6 +247,7 @@
           </w:tcPr>
           <w:p>
             <w:pPr>
+              <w:keepNext w:val="false"/>
               <w:spacing w:after="80"/>
             </w:pPr>
             <w:r>
@@ -274,6 +281,7 @@
           </w:tcPr>
           <w:p>
             <w:pPr>
+              <w:keepNext w:val="false"/>
               <w:spacing w:after="80"/>
             </w:pPr>
             <w:r>
@@ -306,6 +314,7 @@
           </w:tcPr>
           <w:p>
             <w:pPr>
+              <w:keepNext w:val="false"/>
               <w:spacing w:after="80"/>
             </w:pPr>
             <w:r>
@@ -338,6 +347,7 @@
           </w:tcPr>
           <w:p>
             <w:pPr>
+              <w:keepNext w:val="false"/>
               <w:spacing w:after="80"/>
             </w:pPr>
             <w:r>
@@ -371,6 +381,7 @@
           </w:tcPr>
           <w:p>
             <w:pPr>
+              <w:keepNext w:val="false"/>
               <w:spacing w:after="80"/>
             </w:pPr>
             <w:r>
@@ -404,6 +415,7 @@
           </w:tcPr>
           <w:p>
             <w:pPr>
+              <w:keepNext w:val="false"/>
               <w:spacing w:after="80"/>
             </w:pPr>
             <w:r>
@@ -436,6 +448,7 @@
           </w:tcPr>
           <w:p>
             <w:pPr>
+              <w:keepNext w:val="false"/>
               <w:spacing w:after="80"/>
             </w:pPr>
             <w:r>
@@ -468,6 +481,7 @@
           </w:tcPr>
           <w:p>
             <w:pPr>
+              <w:keepNext w:val="false"/>
               <w:spacing w:after="80"/>
             </w:pPr>
             <w:r>
@@ -501,6 +515,7 @@
           </w:tcPr>
           <w:p>
             <w:pPr>
+              <w:keepNext w:val="false"/>
               <w:spacing w:after="80"/>
             </w:pPr>
             <w:r>
@@ -534,6 +549,7 @@
           </w:tcPr>
           <w:p>
             <w:pPr>
+              <w:keepNext w:val="false"/>
               <w:spacing w:after="80"/>
             </w:pPr>
             <w:r>
@@ -606,6 +622,7 @@
           </w:tcPr>
           <w:p>
             <w:pPr>
+              <w:keepNext w:val="false"/>
               <w:spacing w:after="80"/>
             </w:pPr>
             <w:r>
@@ -639,6 +656,7 @@
           </w:tcPr>
           <w:p>
             <w:pPr>
+              <w:keepNext w:val="false"/>
               <w:spacing w:after="80"/>
             </w:pPr>
             <w:r>
@@ -672,6 +690,7 @@
           </w:tcPr>
           <w:p>
             <w:pPr>
+              <w:keepNext w:val="false"/>
               <w:spacing w:after="80"/>
             </w:pPr>
             <w:r>
@@ -705,6 +724,7 @@
           </w:tcPr>
           <w:p>
             <w:pPr>
+              <w:keepNext w:val="false"/>
               <w:spacing w:after="80"/>
             </w:pPr>
             <w:r>
@@ -738,6 +758,7 @@
           </w:tcPr>
           <w:p>
             <w:pPr>
+              <w:keepNext w:val="false"/>
               <w:spacing w:after="80"/>
             </w:pPr>
             <w:r>
@@ -771,6 +792,7 @@
           </w:tcPr>
           <w:p>
             <w:pPr>
+              <w:keepNext w:val="false"/>
               <w:spacing w:after="80"/>
             </w:pPr>
             <w:r>
@@ -804,6 +826,7 @@
           </w:tcPr>
           <w:p>
             <w:pPr>
+              <w:keepNext w:val="false"/>
               <w:spacing w:after="80"/>
             </w:pPr>
             <w:r>
@@ -838,6 +861,7 @@
           </w:tcPr>
           <w:p>
             <w:pPr>
+              <w:keepNext w:val="false"/>
               <w:spacing w:after="80"/>
             </w:pPr>
             <w:r>
@@ -870,6 +894,7 @@
           </w:tcPr>
           <w:p>
             <w:pPr>
+              <w:keepNext w:val="false"/>
               <w:spacing w:after="80"/>
             </w:pPr>
             <w:r>
@@ -902,6 +927,7 @@
           </w:tcPr>
           <w:p>
             <w:pPr>
+              <w:keepNext w:val="false"/>
               <w:spacing w:after="80"/>
             </w:pPr>
             <w:r>
@@ -934,6 +960,7 @@
           </w:tcPr>
           <w:p>
             <w:pPr>
+              <w:keepNext w:val="false"/>
               <w:spacing w:after="80"/>
             </w:pPr>
             <w:r>
@@ -966,6 +993,7 @@
           </w:tcPr>
           <w:p>
             <w:pPr>
+              <w:keepNext w:val="false"/>
               <w:spacing w:after="80"/>
             </w:pPr>
             <w:r>
@@ -998,6 +1026,7 @@
           </w:tcPr>
           <w:p>
             <w:pPr>
+              <w:keepNext w:val="false"/>
               <w:spacing w:after="80"/>
             </w:pPr>
             <w:r>
@@ -1030,6 +1059,7 @@
           </w:tcPr>
           <w:p>
             <w:pPr>
+              <w:keepNext w:val="false"/>
               <w:spacing w:after="80"/>
             </w:pPr>
             <w:r>
@@ -1065,6 +1095,7 @@
           </w:tcPr>
           <w:p>
             <w:pPr>
+              <w:keepNext w:val="false"/>
               <w:spacing w:after="80"/>
             </w:pPr>
             <w:r>
@@ -1098,6 +1129,7 @@
           </w:tcPr>
           <w:p>
             <w:pPr>
+              <w:keepNext w:val="false"/>
               <w:spacing w:after="80"/>
             </w:pPr>
             <w:r>
@@ -1131,6 +1163,7 @@
           </w:tcPr>
           <w:p>
             <w:pPr>
+              <w:keepNext w:val="false"/>
               <w:spacing w:after="80"/>
             </w:pPr>
             <w:r>
@@ -1164,6 +1197,7 @@
           </w:tcPr>
           <w:p>
             <w:pPr>
+              <w:keepNext w:val="false"/>
               <w:spacing w:after="80"/>
             </w:pPr>
             <w:r>
@@ -1197,6 +1231,7 @@
           </w:tcPr>
           <w:p>
             <w:pPr>
+              <w:keepNext w:val="false"/>
               <w:spacing w:after="80"/>
             </w:pPr>
             <w:r>
@@ -1230,6 +1265,7 @@
           </w:tcPr>
           <w:p>
             <w:pPr>
+              <w:keepNext w:val="false"/>
               <w:spacing w:after="80"/>
             </w:pPr>
             <w:r>
@@ -1263,6 +1299,7 @@
           </w:tcPr>
           <w:p>
             <w:pPr>
+              <w:keepNext w:val="false"/>
               <w:spacing w:after="80"/>
             </w:pPr>
             <w:r>
@@ -1297,6 +1334,7 @@
           </w:tcPr>
           <w:p>
             <w:pPr>
+              <w:keepNext w:val="false"/>
               <w:spacing w:after="80"/>
             </w:pPr>
             <w:r>
@@ -1329,6 +1367,7 @@
           </w:tcPr>
           <w:p>
             <w:pPr>
+              <w:keepNext w:val="false"/>
               <w:spacing w:after="80"/>
             </w:pPr>
             <w:r>
@@ -1361,6 +1400,7 @@
           </w:tcPr>
           <w:p>
             <w:pPr>
+              <w:keepNext w:val="false"/>
               <w:spacing w:after="80"/>
             </w:pPr>
             <w:r>
@@ -1393,6 +1433,7 @@
           </w:tcPr>
           <w:p>
             <w:pPr>
+              <w:keepNext w:val="false"/>
               <w:spacing w:after="80"/>
             </w:pPr>
             <w:r>
@@ -1425,6 +1466,7 @@
           </w:tcPr>
           <w:p>
             <w:pPr>
+              <w:keepNext w:val="false"/>
               <w:spacing w:after="80"/>
             </w:pPr>
             <w:r>
@@ -1457,6 +1499,7 @@
           </w:tcPr>
           <w:p>
             <w:pPr>
+              <w:keepNext w:val="false"/>
               <w:spacing w:after="80"/>
             </w:pPr>
             <w:r>
@@ -1489,6 +1532,7 @@
           </w:tcPr>
           <w:p>
             <w:pPr>
+              <w:keepNext w:val="false"/>
               <w:spacing w:after="80"/>
             </w:pPr>
             <w:r>
@@ -1524,6 +1568,7 @@
           </w:tcPr>
           <w:p>
             <w:pPr>
+              <w:keepNext w:val="false"/>
               <w:spacing w:after="80"/>
             </w:pPr>
             <w:r>
@@ -1557,6 +1602,7 @@
           </w:tcPr>
           <w:p>
             <w:pPr>
+              <w:keepNext w:val="false"/>
               <w:spacing w:after="80"/>
             </w:pPr>
             <w:r>
@@ -1590,6 +1636,7 @@
           </w:tcPr>
           <w:p>
             <w:pPr>
+              <w:keepNext w:val="false"/>
               <w:spacing w:after="80"/>
             </w:pPr>
             <w:r>
@@ -1623,6 +1670,7 @@
           </w:tcPr>
           <w:p>
             <w:pPr>
+              <w:keepNext w:val="false"/>
               <w:spacing w:after="80"/>
             </w:pPr>
             <w:r>
@@ -1656,6 +1704,7 @@
           </w:tcPr>
           <w:p>
             <w:pPr>
+              <w:keepNext w:val="false"/>
               <w:spacing w:after="80"/>
             </w:pPr>
             <w:r>
@@ -1689,6 +1738,7 @@
           </w:tcPr>
           <w:p>
             <w:pPr>
+              <w:keepNext w:val="false"/>
               <w:spacing w:after="80"/>
             </w:pPr>
             <w:r>
@@ -1722,6 +1772,7 @@
           </w:tcPr>
           <w:p>
             <w:pPr>
+              <w:keepNext w:val="false"/>
               <w:spacing w:after="80"/>
             </w:pPr>
             <w:r>
@@ -1756,6 +1807,7 @@
           </w:tcPr>
           <w:p>
             <w:pPr>
+              <w:keepNext w:val="false"/>
               <w:spacing w:after="80"/>
             </w:pPr>
             <w:r>
@@ -1788,6 +1840,7 @@
           </w:tcPr>
           <w:p>
             <w:pPr>
+              <w:keepNext w:val="false"/>
               <w:spacing w:after="80"/>
             </w:pPr>
             <w:r>
@@ -1820,6 +1873,7 @@
           </w:tcPr>
           <w:p>
             <w:pPr>
+              <w:keepNext w:val="false"/>
               <w:spacing w:after="80"/>
             </w:pPr>
             <w:r>
@@ -1852,6 +1906,7 @@
           </w:tcPr>
           <w:p>
             <w:pPr>
+              <w:keepNext w:val="false"/>
               <w:spacing w:after="80"/>
             </w:pPr>
             <w:r>
@@ -1884,6 +1939,7 @@
           </w:tcPr>
           <w:p>
             <w:pPr>
+              <w:keepNext w:val="false"/>
               <w:spacing w:after="80"/>
             </w:pPr>
             <w:r>
@@ -1916,6 +1972,7 @@
           </w:tcPr>
           <w:p>
             <w:pPr>
+              <w:keepNext w:val="false"/>
               <w:spacing w:after="80"/>
             </w:pPr>
             <w:r>
@@ -1948,6 +2005,7 @@
           </w:tcPr>
           <w:p>
             <w:pPr>
+              <w:keepNext w:val="false"/>
               <w:spacing w:after="80"/>
             </w:pPr>
             <w:r>
@@ -1983,6 +2041,7 @@
           </w:tcPr>
           <w:p>
             <w:pPr>
+              <w:keepNext w:val="false"/>
               <w:spacing w:after="80"/>
             </w:pPr>
             <w:r>
@@ -2016,6 +2075,7 @@
           </w:tcPr>
           <w:p>
             <w:pPr>
+              <w:keepNext w:val="false"/>
               <w:spacing w:after="80"/>
             </w:pPr>
             <w:r>
@@ -2049,6 +2109,7 @@
           </w:tcPr>
           <w:p>
             <w:pPr>
+              <w:keepNext w:val="false"/>
               <w:spacing w:after="80"/>
             </w:pPr>
             <w:r>
@@ -2082,6 +2143,7 @@
           </w:tcPr>
           <w:p>
             <w:pPr>
+              <w:keepNext w:val="false"/>
               <w:spacing w:after="80"/>
             </w:pPr>
             <w:r>
@@ -2115,6 +2177,7 @@
           </w:tcPr>
           <w:p>
             <w:pPr>
+              <w:keepNext w:val="false"/>
               <w:spacing w:after="80"/>
             </w:pPr>
             <w:r>
@@ -2148,6 +2211,7 @@
           </w:tcPr>
           <w:p>
             <w:pPr>
+              <w:keepNext w:val="false"/>
               <w:spacing w:after="80"/>
             </w:pPr>
             <w:r>
@@ -2181,6 +2245,7 @@
           </w:tcPr>
           <w:p>
             <w:pPr>
+              <w:keepNext w:val="false"/>
               <w:spacing w:after="80"/>
             </w:pPr>
             <w:r>
@@ -2215,6 +2280,7 @@
           </w:tcPr>
           <w:p>
             <w:pPr>
+              <w:keepNext w:val="false"/>
               <w:spacing w:after="80"/>
             </w:pPr>
             <w:r>
@@ -2247,6 +2313,7 @@
           </w:tcPr>
           <w:p>
             <w:pPr>
+              <w:keepNext w:val="false"/>
               <w:spacing w:after="80"/>
             </w:pPr>
             <w:r>
@@ -2279,6 +2346,7 @@
           </w:tcPr>
           <w:p>
             <w:pPr>
+              <w:keepNext w:val="false"/>
               <w:spacing w:after="80"/>
             </w:pPr>
             <w:r>
@@ -2311,6 +2379,7 @@
           </w:tcPr>
           <w:p>
             <w:pPr>
+              <w:keepNext w:val="false"/>
               <w:spacing w:after="80"/>
             </w:pPr>
             <w:r>
@@ -2343,6 +2412,7 @@
           </w:tcPr>
           <w:p>
             <w:pPr>
+              <w:keepNext w:val="false"/>
               <w:spacing w:after="80"/>
             </w:pPr>
             <w:r>
@@ -2375,6 +2445,7 @@
           </w:tcPr>
           <w:p>
             <w:pPr>
+              <w:keepNext w:val="false"/>
               <w:spacing w:after="80"/>
             </w:pPr>
             <w:r>
@@ -2407,6 +2478,7 @@
           </w:tcPr>
           <w:p>
             <w:pPr>
+              <w:keepNext w:val="false"/>
               <w:spacing w:after="80"/>
             </w:pPr>
             <w:r>
@@ -2440,6 +2512,7 @@
     </w:p>
     <w:p>
       <w:pPr>
+        <w:keepNext w:val="false"/>
         <w:spacing w:after="100"/>
       </w:pPr>
       <w:r>
@@ -2453,6 +2526,7 @@
     </w:p>
     <w:p>
       <w:pPr>
+        <w:keepNext w:val="false"/>
         <w:spacing w:after="160"/>
       </w:pPr>
       <w:r>
@@ -2501,6 +2575,7 @@
           </w:tcPr>
           <w:p>
             <w:pPr>
+              <w:keepNext w:val="false"/>
               <w:spacing w:after="60"/>
             </w:pPr>
             <w:r>
@@ -2524,6 +2599,7 @@
           </w:p>
           <w:p>
             <w:pPr>
+              <w:keepNext w:val="false"/>
               <w:spacing w:after="80"/>
             </w:pPr>
             <w:r>
@@ -2537,6 +2613,7 @@
           </w:p>
           <w:p>
             <w:pPr>
+              <w:keepNext w:val="false"/>
               <w:spacing w:before="80"/>
             </w:pPr>
             <w:r>
@@ -2553,6 +2630,7 @@
     </w:tbl>
     <w:p>
       <w:pPr>
+        <w:keepNext w:val="false"/>
         <w:spacing w:after="100"/>
       </w:pPr>
     </w:p>
@@ -2593,6 +2671,7 @@
           </w:tcPr>
           <w:p>
             <w:pPr>
+              <w:keepNext w:val="false"/>
               <w:spacing w:after="60"/>
             </w:pPr>
             <w:r>
@@ -2616,6 +2695,7 @@
           </w:p>
           <w:p>
             <w:pPr>
+              <w:keepNext w:val="false"/>
               <w:spacing w:after="80"/>
             </w:pPr>
             <w:r>
@@ -2629,6 +2709,7 @@
           </w:p>
           <w:p>
             <w:pPr>
+              <w:keepNext w:val="false"/>
               <w:spacing w:before="80"/>
             </w:pPr>
             <w:r>
@@ -2645,6 +2726,7 @@
     </w:tbl>
     <w:p>
       <w:pPr>
+        <w:keepNext w:val="false"/>
         <w:spacing w:after="100"/>
       </w:pPr>
     </w:p>
@@ -2685,6 +2767,7 @@
           </w:tcPr>
           <w:p>
             <w:pPr>
+              <w:keepNext w:val="false"/>
               <w:spacing w:after="60"/>
             </w:pPr>
             <w:r>
@@ -2708,6 +2791,7 @@
           </w:p>
           <w:p>
             <w:pPr>
+              <w:keepNext w:val="false"/>
               <w:spacing w:after="80"/>
             </w:pPr>
             <w:r>
@@ -2721,6 +2805,7 @@
           </w:p>
           <w:p>
             <w:pPr>
+              <w:keepNext w:val="false"/>
               <w:spacing w:before="80"/>
             </w:pPr>
             <w:r>
@@ -2737,6 +2822,7 @@
     </w:tbl>
     <w:p>
       <w:pPr>
+        <w:keepNext w:val="false"/>
         <w:spacing w:after="100"/>
       </w:pPr>
     </w:p>
@@ -2777,6 +2863,7 @@
           </w:tcPr>
           <w:p>
             <w:pPr>
+              <w:keepNext w:val="false"/>
               <w:spacing w:after="60"/>
             </w:pPr>
             <w:r>
@@ -2800,6 +2887,7 @@
           </w:p>
           <w:p>
             <w:pPr>
+              <w:keepNext w:val="false"/>
               <w:spacing w:after="80"/>
             </w:pPr>
             <w:r>
@@ -2813,6 +2901,7 @@
           </w:p>
           <w:p>
             <w:pPr>
+              <w:keepNext w:val="false"/>
               <w:spacing w:before="80"/>
             </w:pPr>
             <w:r>
@@ -2829,6 +2918,7 @@
     </w:tbl>
     <w:p>
       <w:pPr>
+        <w:keepNext w:val="false"/>
         <w:spacing w:after="100"/>
       </w:pPr>
     </w:p>
@@ -2869,6 +2959,7 @@
           </w:tcPr>
           <w:p>
             <w:pPr>
+              <w:keepNext w:val="false"/>
               <w:spacing w:after="60"/>
             </w:pPr>
             <w:r>
@@ -2892,6 +2983,7 @@
           </w:p>
           <w:p>
             <w:pPr>
+              <w:keepNext w:val="false"/>
               <w:spacing w:after="80"/>
             </w:pPr>
             <w:r>
@@ -2905,6 +2997,7 @@
           </w:p>
           <w:p>
             <w:pPr>
+              <w:keepNext w:val="false"/>
               <w:spacing w:before="80"/>
             </w:pPr>
             <w:r>
@@ -2921,6 +3014,7 @@
     </w:tbl>
     <w:p>
       <w:pPr>
+        <w:keepNext w:val="false"/>
         <w:spacing w:after="100"/>
       </w:pPr>
     </w:p>
@@ -2961,6 +3055,7 @@
           </w:tcPr>
           <w:p>
             <w:pPr>
+              <w:keepNext w:val="false"/>
               <w:spacing w:after="60"/>
             </w:pPr>
             <w:r>
@@ -2984,6 +3079,7 @@
           </w:p>
           <w:p>
             <w:pPr>
+              <w:keepNext w:val="false"/>
               <w:spacing w:after="80"/>
             </w:pPr>
             <w:r>
@@ -2997,6 +3093,7 @@
           </w:p>
           <w:p>
             <w:pPr>
+              <w:keepNext w:val="false"/>
               <w:spacing w:before="80"/>
             </w:pPr>
             <w:r>
@@ -3013,6 +3110,7 @@
     </w:tbl>
     <w:p>
       <w:pPr>
+        <w:keepNext w:val="false"/>
         <w:spacing w:after="100"/>
       </w:pPr>
     </w:p>
@@ -3053,6 +3151,7 @@
           </w:tcPr>
           <w:p>
             <w:pPr>
+              <w:keepNext w:val="false"/>
               <w:spacing w:after="60"/>
             </w:pPr>
             <w:r>
@@ -3076,6 +3175,7 @@
           </w:p>
           <w:p>
             <w:pPr>
+              <w:keepNext w:val="false"/>
               <w:spacing w:after="80"/>
             </w:pPr>
             <w:r>
@@ -3089,6 +3189,7 @@
           </w:p>
           <w:p>
             <w:pPr>
+              <w:keepNext w:val="false"/>
               <w:spacing w:before="80"/>
             </w:pPr>
             <w:r>
@@ -3105,6 +3206,7 @@
     </w:tbl>
     <w:p>
       <w:pPr>
+        <w:keepNext w:val="false"/>
         <w:spacing w:after="100"/>
       </w:pPr>
     </w:p>
@@ -3145,6 +3247,7 @@
           </w:tcPr>
           <w:p>
             <w:pPr>
+              <w:keepNext w:val="false"/>
               <w:spacing w:after="60"/>
             </w:pPr>
             <w:r>
@@ -3168,6 +3271,7 @@
           </w:p>
           <w:p>
             <w:pPr>
+              <w:keepNext w:val="false"/>
               <w:spacing w:after="80"/>
             </w:pPr>
             <w:r>
@@ -3181,6 +3285,7 @@
           </w:p>
           <w:p>
             <w:pPr>
+              <w:keepNext w:val="false"/>
               <w:spacing w:before="80"/>
             </w:pPr>
             <w:r>
@@ -3197,6 +3302,7 @@
     </w:tbl>
     <w:p>
       <w:pPr>
+        <w:keepNext w:val="false"/>
         <w:spacing w:after="100"/>
       </w:pPr>
     </w:p>
@@ -3237,6 +3343,7 @@
           </w:tcPr>
           <w:p>
             <w:pPr>
+              <w:keepNext w:val="false"/>
               <w:spacing w:after="60"/>
             </w:pPr>
             <w:r>
@@ -3260,6 +3367,7 @@
           </w:p>
           <w:p>
             <w:pPr>
+              <w:keepNext w:val="false"/>
               <w:spacing w:after="80"/>
             </w:pPr>
             <w:r>
@@ -3273,6 +3381,7 @@
           </w:p>
           <w:p>
             <w:pPr>
+              <w:keepNext w:val="false"/>
               <w:spacing w:before="80"/>
             </w:pPr>
             <w:r>
@@ -3289,6 +3398,7 @@
     </w:tbl>
     <w:p>
       <w:pPr>
+        <w:keepNext w:val="false"/>
         <w:spacing w:after="100"/>
       </w:pPr>
     </w:p>
@@ -3329,6 +3439,7 @@
           </w:tcPr>
           <w:p>
             <w:pPr>
+              <w:keepNext w:val="false"/>
               <w:spacing w:after="60"/>
             </w:pPr>
             <w:r>
@@ -3352,6 +3463,7 @@
           </w:p>
           <w:p>
             <w:pPr>
+              <w:keepNext w:val="false"/>
               <w:spacing w:after="80"/>
             </w:pPr>
             <w:r>
@@ -3365,6 +3477,7 @@
           </w:p>
           <w:p>
             <w:pPr>
+              <w:keepNext w:val="false"/>
               <w:spacing w:before="80"/>
             </w:pPr>
             <w:r>
@@ -3381,6 +3494,7 @@
     </w:tbl>
     <w:p>
       <w:pPr>
+        <w:keepNext w:val="false"/>
         <w:spacing w:after="100"/>
       </w:pPr>
     </w:p>
@@ -3421,6 +3535,7 @@
           </w:tcPr>
           <w:p>
             <w:pPr>
+              <w:keepNext w:val="false"/>
               <w:spacing w:after="60"/>
             </w:pPr>
             <w:r>
@@ -3444,6 +3559,7 @@
           </w:p>
           <w:p>
             <w:pPr>
+              <w:keepNext w:val="false"/>
               <w:spacing w:after="80"/>
             </w:pPr>
             <w:r>
@@ -3457,6 +3573,7 @@
           </w:p>
           <w:p>
             <w:pPr>
+              <w:keepNext w:val="false"/>
               <w:spacing w:before="80"/>
             </w:pPr>
             <w:r>
@@ -3488,6 +3605,7 @@
     </w:p>
     <w:p>
       <w:pPr>
+        <w:keepNext w:val="false"/>
         <w:spacing w:after="100"/>
       </w:pPr>
       <w:r>
@@ -3501,6 +3619,7 @@
     </w:p>
     <w:p>
       <w:pPr>
+        <w:keepNext w:val="false"/>
         <w:spacing w:after="160"/>
       </w:pPr>
       <w:r>
@@ -3549,6 +3668,7 @@
           </w:tcPr>
           <w:p>
             <w:pPr>
+              <w:keepNext w:val="false"/>
               <w:spacing w:after="60"/>
             </w:pPr>
             <w:r>
@@ -3572,6 +3692,7 @@
           </w:p>
           <w:p>
             <w:pPr>
+              <w:keepNext w:val="false"/>
               <w:spacing w:after="80"/>
             </w:pPr>
             <w:r>
@@ -3585,6 +3706,7 @@
           </w:p>
           <w:p>
             <w:pPr>
+              <w:keepNext w:val="false"/>
               <w:spacing w:after="40"/>
               <w:ind w:left="240"/>
             </w:pPr>
@@ -3609,6 +3731,7 @@
           </w:p>
           <w:p>
             <w:pPr>
+              <w:keepNext w:val="false"/>
               <w:spacing w:after="40"/>
               <w:ind w:left="240"/>
             </w:pPr>
@@ -3633,6 +3756,7 @@
           </w:p>
           <w:p>
             <w:pPr>
+              <w:keepNext w:val="false"/>
               <w:spacing w:after="40"/>
               <w:ind w:left="240"/>
             </w:pPr>
@@ -3657,6 +3781,7 @@
           </w:p>
           <w:p>
             <w:pPr>
+              <w:keepNext w:val="false"/>
               <w:spacing w:after="40"/>
               <w:ind w:left="240"/>
             </w:pPr>
@@ -3684,6 +3809,7 @@
     </w:tbl>
     <w:p>
       <w:pPr>
+        <w:keepNext w:val="false"/>
         <w:spacing w:after="100"/>
       </w:pPr>
     </w:p>
@@ -3724,6 +3850,7 @@
           </w:tcPr>
           <w:p>
             <w:pPr>
+              <w:keepNext w:val="false"/>
               <w:spacing w:after="60"/>
             </w:pPr>
             <w:r>
@@ -3747,6 +3874,7 @@
           </w:p>
           <w:p>
             <w:pPr>
+              <w:keepNext w:val="false"/>
               <w:spacing w:after="80"/>
             </w:pPr>
             <w:r>
@@ -3760,6 +3888,7 @@
           </w:p>
           <w:p>
             <w:pPr>
+              <w:keepNext w:val="false"/>
               <w:spacing w:after="40"/>
               <w:ind w:left="240"/>
             </w:pPr>
@@ -3784,6 +3913,7 @@
           </w:p>
           <w:p>
             <w:pPr>
+              <w:keepNext w:val="false"/>
               <w:spacing w:after="40"/>
               <w:ind w:left="240"/>
             </w:pPr>
@@ -3808,6 +3938,7 @@
           </w:p>
           <w:p>
             <w:pPr>
+              <w:keepNext w:val="false"/>
               <w:spacing w:after="40"/>
               <w:ind w:left="240"/>
             </w:pPr>
@@ -3832,6 +3963,7 @@
           </w:p>
           <w:p>
             <w:pPr>
+              <w:keepNext w:val="false"/>
               <w:spacing w:after="40"/>
               <w:ind w:left="240"/>
             </w:pPr>
@@ -3859,6 +3991,7 @@
     </w:tbl>
     <w:p>
       <w:pPr>
+        <w:keepNext w:val="false"/>
         <w:spacing w:after="100"/>
       </w:pPr>
     </w:p>
@@ -3899,6 +4032,7 @@
           </w:tcPr>
           <w:p>
             <w:pPr>
+              <w:keepNext w:val="false"/>
               <w:spacing w:after="60"/>
             </w:pPr>
             <w:r>
@@ -3922,6 +4056,7 @@
           </w:p>
           <w:p>
             <w:pPr>
+              <w:keepNext w:val="false"/>
               <w:spacing w:after="80"/>
             </w:pPr>
             <w:r>
@@ -3935,6 +4070,7 @@
           </w:p>
           <w:p>
             <w:pPr>
+              <w:keepNext w:val="false"/>
               <w:spacing w:after="40"/>
               <w:ind w:left="240"/>
             </w:pPr>
@@ -3959,6 +4095,7 @@
           </w:p>
           <w:p>
             <w:pPr>
+              <w:keepNext w:val="false"/>
               <w:spacing w:after="40"/>
               <w:ind w:left="240"/>
             </w:pPr>
@@ -3983,6 +4120,7 @@
           </w:p>
           <w:p>
             <w:pPr>
+              <w:keepNext w:val="false"/>
               <w:spacing w:after="40"/>
               <w:ind w:left="240"/>
             </w:pPr>
@@ -4007,6 +4145,7 @@
           </w:p>
           <w:p>
             <w:pPr>
+              <w:keepNext w:val="false"/>
               <w:spacing w:after="40"/>
               <w:ind w:left="240"/>
             </w:pPr>
@@ -4034,6 +4173,7 @@
     </w:tbl>
     <w:p>
       <w:pPr>
+        <w:keepNext w:val="false"/>
         <w:spacing w:after="100"/>
       </w:pPr>
     </w:p>
@@ -4074,6 +4214,7 @@
           </w:tcPr>
           <w:p>
             <w:pPr>
+              <w:keepNext w:val="false"/>
               <w:spacing w:after="60"/>
             </w:pPr>
             <w:r>
@@ -4097,6 +4238,7 @@
           </w:p>
           <w:p>
             <w:pPr>
+              <w:keepNext w:val="false"/>
               <w:spacing w:after="80"/>
             </w:pPr>
             <w:r>
@@ -4110,6 +4252,7 @@
           </w:p>
           <w:p>
             <w:pPr>
+              <w:keepNext w:val="false"/>
               <w:spacing w:after="900" w:before="80"/>
             </w:pPr>
             <w:r>
@@ -4123,6 +4266,7 @@
           </w:p>
           <w:p>
             <w:pPr>
+              <w:keepNext w:val="false"/>
               <w:spacing w:after="80"/>
             </w:pPr>
             <w:r>
@@ -4139,6 +4283,7 @@
     </w:tbl>
     <w:p>
       <w:pPr>
+        <w:keepNext w:val="false"/>
         <w:spacing w:after="100"/>
       </w:pPr>
     </w:p>
@@ -4179,6 +4324,7 @@
           </w:tcPr>
           <w:p>
             <w:pPr>
+              <w:keepNext w:val="false"/>
               <w:spacing w:after="60"/>
             </w:pPr>
             <w:r>
@@ -4202,6 +4348,7 @@
           </w:p>
           <w:p>
             <w:pPr>
+              <w:keepNext w:val="false"/>
               <w:spacing w:after="80"/>
             </w:pPr>
             <w:r>
@@ -4215,6 +4362,7 @@
           </w:p>
           <w:p>
             <w:pPr>
+              <w:keepNext w:val="false"/>
               <w:spacing w:after="40"/>
               <w:ind w:left="240"/>
             </w:pPr>
@@ -4239,6 +4387,7 @@
           </w:p>
           <w:p>
             <w:pPr>
+              <w:keepNext w:val="false"/>
               <w:spacing w:after="40"/>
               <w:ind w:left="240"/>
             </w:pPr>
@@ -4263,6 +4412,7 @@
           </w:p>
           <w:p>
             <w:pPr>
+              <w:keepNext w:val="false"/>
               <w:spacing w:after="40"/>
               <w:ind w:left="240"/>
             </w:pPr>
@@ -4287,6 +4437,7 @@
           </w:p>
           <w:p>
             <w:pPr>
+              <w:keepNext w:val="false"/>
               <w:spacing w:after="40"/>
               <w:ind w:left="240"/>
             </w:pPr>
@@ -4311,6 +4462,7 @@
           </w:p>
           <w:p>
             <w:pPr>
+              <w:keepNext w:val="false"/>
               <w:spacing w:after="40"/>
               <w:ind w:left="240"/>
             </w:pPr>
@@ -4335,6 +4487,7 @@
           </w:p>
           <w:p>
             <w:pPr>
+              <w:keepNext w:val="false"/>
               <w:spacing w:after="40"/>
               <w:ind w:left="240"/>
             </w:pPr>
@@ -4359,6 +4512,7 @@
           </w:p>
           <w:p>
             <w:pPr>
+              <w:keepNext w:val="false"/>
               <w:spacing w:before="80"/>
             </w:pPr>
             <w:r>
@@ -4390,6 +4544,7 @@
     </w:p>
     <w:p>
       <w:pPr>
+        <w:keepNext w:val="false"/>
         <w:spacing w:after="100"/>
       </w:pPr>
       <w:r>
@@ -4403,6 +4558,7 @@
     </w:p>
     <w:p>
       <w:pPr>
+        <w:keepNext w:val="false"/>
         <w:spacing w:after="160"/>
       </w:pPr>
       <w:r>
@@ -4451,6 +4607,7 @@
           </w:tcPr>
           <w:p>
             <w:pPr>
+              <w:keepNext w:val="false"/>
               <w:spacing w:after="60"/>
             </w:pPr>
             <w:r>
@@ -4474,6 +4631,7 @@
           </w:p>
           <w:p>
             <w:pPr>
+              <w:keepNext w:val="false"/>
               <w:spacing w:after="80"/>
             </w:pPr>
             <w:r>
@@ -4487,6 +4645,7 @@
           </w:p>
           <w:p>
             <w:pPr>
+              <w:keepNext w:val="false"/>
               <w:spacing w:after="40"/>
               <w:ind w:left="240"/>
             </w:pPr>
@@ -4511,6 +4670,7 @@
           </w:p>
           <w:p>
             <w:pPr>
+              <w:keepNext w:val="false"/>
               <w:spacing w:after="40"/>
               <w:ind w:left="240"/>
             </w:pPr>
@@ -4535,6 +4695,7 @@
           </w:p>
           <w:p>
             <w:pPr>
+              <w:keepNext w:val="false"/>
               <w:spacing w:after="40"/>
               <w:ind w:left="240"/>
             </w:pPr>
@@ -4559,6 +4720,7 @@
           </w:p>
           <w:p>
             <w:pPr>
+              <w:keepNext w:val="false"/>
               <w:spacing w:after="40"/>
               <w:ind w:left="240"/>
             </w:pPr>
@@ -4586,6 +4748,7 @@
     </w:tbl>
     <w:p>
       <w:pPr>
+        <w:keepNext w:val="false"/>
         <w:spacing w:after="100"/>
       </w:pPr>
     </w:p>
@@ -4626,6 +4789,7 @@
           </w:tcPr>
           <w:p>
             <w:pPr>
+              <w:keepNext w:val="false"/>
               <w:spacing w:after="60"/>
             </w:pPr>
             <w:r>
@@ -4649,6 +4813,7 @@
           </w:p>
           <w:p>
             <w:pPr>
+              <w:keepNext w:val="false"/>
               <w:spacing w:after="80"/>
             </w:pPr>
             <w:r>
@@ -4662,6 +4827,7 @@
           </w:p>
           <w:p>
             <w:pPr>
+              <w:keepNext w:val="false"/>
               <w:spacing w:after="40"/>
               <w:ind w:left="240"/>
             </w:pPr>
@@ -4686,6 +4852,7 @@
           </w:p>
           <w:p>
             <w:pPr>
+              <w:keepNext w:val="false"/>
               <w:spacing w:after="40"/>
               <w:ind w:left="240"/>
             </w:pPr>
@@ -4710,6 +4877,7 @@
           </w:p>
           <w:p>
             <w:pPr>
+              <w:keepNext w:val="false"/>
               <w:spacing w:after="40"/>
               <w:ind w:left="240"/>
             </w:pPr>
@@ -4734,6 +4902,7 @@
           </w:p>
           <w:p>
             <w:pPr>
+              <w:keepNext w:val="false"/>
               <w:spacing w:after="40"/>
               <w:ind w:left="240"/>
             </w:pPr>
@@ -4761,6 +4930,7 @@
     </w:tbl>
     <w:p>
       <w:pPr>
+        <w:keepNext w:val="false"/>
         <w:spacing w:after="100"/>
       </w:pPr>
     </w:p>
@@ -4801,6 +4971,7 @@
           </w:tcPr>
           <w:p>
             <w:pPr>
+              <w:keepNext w:val="false"/>
               <w:spacing w:after="60"/>
             </w:pPr>
             <w:r>
@@ -4824,6 +4995,7 @@
           </w:p>
           <w:p>
             <w:pPr>
+              <w:keepNext w:val="false"/>
               <w:spacing w:after="80"/>
             </w:pPr>
             <w:r>
@@ -4837,6 +5009,7 @@
           </w:p>
           <w:p>
             <w:pPr>
+              <w:keepNext w:val="false"/>
               <w:spacing w:after="40"/>
               <w:ind w:left="240"/>
             </w:pPr>
@@ -4861,6 +5034,7 @@
           </w:p>
           <w:p>
             <w:pPr>
+              <w:keepNext w:val="false"/>
               <w:spacing w:after="40"/>
               <w:ind w:left="240"/>
             </w:pPr>
@@ -4885,6 +5059,7 @@
           </w:p>
           <w:p>
             <w:pPr>
+              <w:keepNext w:val="false"/>
               <w:spacing w:after="40"/>
               <w:ind w:left="240"/>
             </w:pPr>
@@ -4909,6 +5084,7 @@
           </w:p>
           <w:p>
             <w:pPr>
+              <w:keepNext w:val="false"/>
               <w:spacing w:after="40"/>
               <w:ind w:left="240"/>
             </w:pPr>
@@ -4936,6 +5112,7 @@
     </w:tbl>
     <w:p>
       <w:pPr>
+        <w:keepNext w:val="false"/>
         <w:spacing w:after="100"/>
       </w:pPr>
     </w:p>
@@ -4976,6 +5153,7 @@
           </w:tcPr>
           <w:p>
             <w:pPr>
+              <w:keepNext w:val="false"/>
               <w:spacing w:after="60"/>
             </w:pPr>
             <w:r>
@@ -4999,6 +5177,7 @@
           </w:p>
           <w:p>
             <w:pPr>
+              <w:keepNext w:val="false"/>
               <w:spacing w:after="80"/>
             </w:pPr>
             <w:r>
@@ -5012,6 +5191,7 @@
           </w:p>
           <w:p>
             <w:pPr>
+              <w:keepNext w:val="false"/>
               <w:spacing w:after="40"/>
               <w:ind w:left="240"/>
             </w:pPr>
@@ -5036,6 +5216,7 @@
           </w:p>
           <w:p>
             <w:pPr>
+              <w:keepNext w:val="false"/>
               <w:spacing w:after="40"/>
               <w:ind w:left="240"/>
             </w:pPr>
@@ -5060,6 +5241,7 @@
           </w:p>
           <w:p>
             <w:pPr>
+              <w:keepNext w:val="false"/>
               <w:spacing w:after="40"/>
               <w:ind w:left="240"/>
             </w:pPr>
@@ -5084,6 +5266,7 @@
           </w:p>
           <w:p>
             <w:pPr>
+              <w:keepNext w:val="false"/>
               <w:spacing w:after="40"/>
               <w:ind w:left="240"/>
             </w:pPr>
@@ -5111,6 +5294,7 @@
     </w:tbl>
     <w:p>
       <w:pPr>
+        <w:keepNext w:val="false"/>
         <w:spacing w:after="100"/>
       </w:pPr>
     </w:p>
@@ -5151,6 +5335,7 @@
           </w:tcPr>
           <w:p>
             <w:pPr>
+              <w:keepNext w:val="false"/>
               <w:spacing w:after="60"/>
             </w:pPr>
             <w:r>
@@ -5174,6 +5359,7 @@
           </w:p>
           <w:p>
             <w:pPr>
+              <w:keepNext w:val="false"/>
               <w:spacing w:after="80"/>
             </w:pPr>
             <w:r>
@@ -5187,6 +5373,7 @@
           </w:p>
           <w:p>
             <w:pPr>
+              <w:keepNext w:val="false"/>
               <w:spacing w:after="40"/>
               <w:ind w:left="240"/>
             </w:pPr>
@@ -5211,6 +5398,7 @@
           </w:p>
           <w:p>
             <w:pPr>
+              <w:keepNext w:val="false"/>
               <w:spacing w:after="40"/>
               <w:ind w:left="240"/>
             </w:pPr>
@@ -5235,6 +5423,7 @@
           </w:p>
           <w:p>
             <w:pPr>
+              <w:keepNext w:val="false"/>
               <w:spacing w:after="40"/>
               <w:ind w:left="240"/>
             </w:pPr>
@@ -5259,6 +5448,7 @@
           </w:p>
           <w:p>
             <w:pPr>
+              <w:keepNext w:val="false"/>
               <w:spacing w:after="40"/>
               <w:ind w:left="240"/>
             </w:pPr>
@@ -5286,6 +5476,7 @@
     </w:tbl>
     <w:p>
       <w:pPr>
+        <w:keepNext w:val="false"/>
         <w:spacing w:after="100"/>
       </w:pPr>
     </w:p>
@@ -5326,6 +5517,7 @@
           </w:tcPr>
           <w:p>
             <w:pPr>
+              <w:keepNext w:val="false"/>
               <w:spacing w:after="60"/>
             </w:pPr>
             <w:r>
@@ -5349,6 +5541,7 @@
           </w:p>
           <w:p>
             <w:pPr>
+              <w:keepNext w:val="false"/>
               <w:spacing w:after="80"/>
             </w:pPr>
             <w:r>
@@ -5362,6 +5555,7 @@
           </w:p>
           <w:p>
             <w:pPr>
+              <w:keepNext w:val="false"/>
               <w:spacing w:after="40"/>
               <w:ind w:left="240"/>
             </w:pPr>
@@ -5386,6 +5580,7 @@
           </w:p>
           <w:p>
             <w:pPr>
+              <w:keepNext w:val="false"/>
               <w:spacing w:after="40"/>
               <w:ind w:left="240"/>
             </w:pPr>
@@ -5410,6 +5605,7 @@
           </w:p>
           <w:p>
             <w:pPr>
+              <w:keepNext w:val="false"/>
               <w:spacing w:after="40"/>
               <w:ind w:left="240"/>
             </w:pPr>
@@ -5434,6 +5630,7 @@
           </w:p>
           <w:p>
             <w:pPr>
+              <w:keepNext w:val="false"/>
               <w:spacing w:after="40"/>
               <w:ind w:left="240"/>
             </w:pPr>
@@ -5461,6 +5658,7 @@
     </w:tbl>
     <w:p>
       <w:pPr>
+        <w:keepNext w:val="false"/>
         <w:spacing w:after="100"/>
       </w:pPr>
     </w:p>
@@ -5502,6 +5700,7 @@
           </w:tcPr>
           <w:p>
             <w:pPr>
+              <w:keepNext/>
               <w:spacing w:after="80"/>
             </w:pPr>
             <w:r>
@@ -5517,6 +5716,7 @@
           </w:p>
           <w:p>
             <w:pPr>
+              <w:keepNext/>
               <w:spacing w:after="80"/>
             </w:pPr>
             <w:r>
@@ -5530,6 +5730,7 @@
           </w:p>
           <w:p>
             <w:pPr>
+              <w:keepNext/>
               <w:spacing w:after="80"/>
             </w:pPr>
             <w:r>
@@ -5555,6 +5756,7 @@
           </w:p>
           <w:p>
             <w:pPr>
+              <w:keepNext/>
               <w:spacing w:after="60" w:before="60"/>
               <w:jc w:val="center"/>
             </w:pPr>
@@ -5604,6 +5806,7 @@
     </w:tbl>
     <w:p>
       <w:pPr>
+        <w:keepNext/>
         <w:spacing w:after="100"/>
       </w:pPr>
     </w:p>
@@ -5644,6 +5847,7 @@
           </w:tcPr>
           <w:p>
             <w:pPr>
+              <w:keepNext w:val="false"/>
               <w:spacing w:after="60"/>
             </w:pPr>
             <w:r>
@@ -5667,6 +5871,7 @@
           </w:p>
           <w:p>
             <w:pPr>
+              <w:keepNext w:val="false"/>
               <w:spacing w:after="80"/>
             </w:pPr>
             <w:r>
@@ -5680,6 +5885,7 @@
           </w:p>
           <w:p>
             <w:pPr>
+              <w:keepNext w:val="false"/>
               <w:spacing w:before="80"/>
             </w:pPr>
             <w:r>
@@ -5696,6 +5902,7 @@
     </w:tbl>
     <w:p>
       <w:pPr>
+        <w:keepNext w:val="false"/>
         <w:spacing w:after="100"/>
       </w:pPr>
     </w:p>
@@ -5736,6 +5943,7 @@
           </w:tcPr>
           <w:p>
             <w:pPr>
+              <w:keepNext w:val="false"/>
               <w:spacing w:after="60"/>
             </w:pPr>
             <w:r>
@@ -5759,6 +5967,7 @@
           </w:p>
           <w:p>
             <w:pPr>
+              <w:keepNext w:val="false"/>
               <w:spacing w:after="80"/>
             </w:pPr>
             <w:r>
@@ -5772,6 +5981,7 @@
           </w:p>
           <w:p>
             <w:pPr>
+              <w:keepNext w:val="false"/>
               <w:spacing w:before="80"/>
             </w:pPr>
             <w:r>
@@ -5788,6 +5998,7 @@
     </w:tbl>
     <w:p>
       <w:pPr>
+        <w:keepNext w:val="false"/>
         <w:spacing w:after="100"/>
       </w:pPr>
     </w:p>
@@ -5828,6 +6039,7 @@
           </w:tcPr>
           <w:p>
             <w:pPr>
+              <w:keepNext w:val="false"/>
               <w:spacing w:after="60"/>
             </w:pPr>
             <w:r>
@@ -5851,6 +6063,7 @@
           </w:p>
           <w:p>
             <w:pPr>
+              <w:keepNext w:val="false"/>
               <w:spacing w:after="80"/>
             </w:pPr>
             <w:r>
@@ -5864,6 +6077,7 @@
           </w:p>
           <w:p>
             <w:pPr>
+              <w:keepNext w:val="false"/>
               <w:spacing w:after="40"/>
               <w:ind w:left="240"/>
             </w:pPr>
@@ -5888,6 +6102,7 @@
           </w:p>
           <w:p>
             <w:pPr>
+              <w:keepNext w:val="false"/>
               <w:spacing w:after="40"/>
               <w:ind w:left="240"/>
             </w:pPr>
@@ -5912,6 +6127,7 @@
           </w:p>
           <w:p>
             <w:pPr>
+              <w:keepNext w:val="false"/>
               <w:spacing w:after="40"/>
               <w:ind w:left="240"/>
             </w:pPr>
@@ -5936,6 +6152,7 @@
           </w:p>
           <w:p>
             <w:pPr>
+              <w:keepNext w:val="false"/>
               <w:spacing w:after="40"/>
               <w:ind w:left="240"/>
             </w:pPr>
@@ -5963,6 +6180,7 @@
     </w:tbl>
     <w:p>
       <w:pPr>
+        <w:keepNext w:val="false"/>
         <w:spacing w:after="100"/>
       </w:pPr>
     </w:p>
@@ -6003,6 +6221,7 @@
           </w:tcPr>
           <w:p>
             <w:pPr>
+              <w:keepNext w:val="false"/>
               <w:spacing w:after="60"/>
             </w:pPr>
             <w:r>
@@ -6026,6 +6245,7 @@
           </w:p>
           <w:p>
             <w:pPr>
+              <w:keepNext w:val="false"/>
               <w:spacing w:after="80"/>
             </w:pPr>
             <w:r>
@@ -6039,6 +6259,7 @@
           </w:p>
           <w:p>
             <w:pPr>
+              <w:keepNext w:val="false"/>
               <w:spacing w:before="80"/>
             </w:pPr>
             <w:r>
@@ -6055,6 +6276,7 @@
     </w:tbl>
     <w:p>
       <w:pPr>
+        <w:keepNext w:val="false"/>
         <w:spacing w:after="100"/>
       </w:pPr>
     </w:p>
@@ -6095,6 +6317,7 @@
           </w:tcPr>
           <w:p>
             <w:pPr>
+              <w:keepNext w:val="false"/>
               <w:spacing w:after="60"/>
             </w:pPr>
             <w:r>
@@ -6118,6 +6341,7 @@
           </w:p>
           <w:p>
             <w:pPr>
+              <w:keepNext w:val="false"/>
               <w:spacing w:after="80"/>
             </w:pPr>
             <w:r>
@@ -6131,6 +6355,7 @@
           </w:p>
           <w:p>
             <w:pPr>
+              <w:keepNext w:val="false"/>
               <w:spacing w:after="900" w:before="80"/>
             </w:pPr>
             <w:r>
@@ -6144,6 +6369,7 @@
           </w:p>
           <w:p>
             <w:pPr>
+              <w:keepNext w:val="false"/>
               <w:spacing w:after="80"/>
             </w:pPr>
             <w:r>
@@ -6175,6 +6401,7 @@
     </w:p>
     <w:p>
       <w:pPr>
+        <w:keepNext w:val="false"/>
         <w:spacing w:after="100"/>
       </w:pPr>
       <w:r>
@@ -6188,6 +6415,7 @@
     </w:p>
     <w:p>
       <w:pPr>
+        <w:keepNext w:val="false"/>
         <w:spacing w:after="160"/>
       </w:pPr>
       <w:r>
@@ -6236,6 +6464,7 @@
           </w:tcPr>
           <w:p>
             <w:pPr>
+              <w:keepNext w:val="false"/>
               <w:spacing w:after="60"/>
             </w:pPr>
             <w:r>
@@ -6259,6 +6488,7 @@
           </w:p>
           <w:p>
             <w:pPr>
+              <w:keepNext w:val="false"/>
               <w:spacing w:after="80"/>
             </w:pPr>
             <w:r>
@@ -6272,6 +6502,7 @@
           </w:p>
           <w:p>
             <w:pPr>
+              <w:keepNext w:val="false"/>
               <w:spacing w:after="40"/>
               <w:ind w:left="240"/>
             </w:pPr>
@@ -6296,6 +6527,7 @@
           </w:p>
           <w:p>
             <w:pPr>
+              <w:keepNext w:val="false"/>
               <w:spacing w:after="40"/>
               <w:ind w:left="240"/>
             </w:pPr>
@@ -6320,6 +6552,7 @@
           </w:p>
           <w:p>
             <w:pPr>
+              <w:keepNext w:val="false"/>
               <w:spacing w:after="40"/>
               <w:ind w:left="240"/>
             </w:pPr>
@@ -6344,6 +6577,7 @@
           </w:p>
           <w:p>
             <w:pPr>
+              <w:keepNext w:val="false"/>
               <w:spacing w:after="40"/>
               <w:ind w:left="240"/>
             </w:pPr>
@@ -6371,6 +6605,7 @@
     </w:tbl>
     <w:p>
       <w:pPr>
+        <w:keepNext w:val="false"/>
         <w:spacing w:after="100"/>
       </w:pPr>
     </w:p>
@@ -6411,6 +6646,7 @@
           </w:tcPr>
           <w:p>
             <w:pPr>
+              <w:keepNext w:val="false"/>
               <w:spacing w:after="60"/>
             </w:pPr>
             <w:r>
@@ -6434,6 +6670,7 @@
           </w:p>
           <w:p>
             <w:pPr>
+              <w:keepNext w:val="false"/>
               <w:spacing w:after="80"/>
             </w:pPr>
             <w:r>
@@ -6447,6 +6684,7 @@
           </w:p>
           <w:p>
             <w:pPr>
+              <w:keepNext w:val="false"/>
               <w:spacing w:after="40"/>
               <w:ind w:left="240"/>
             </w:pPr>
@@ -6471,6 +6709,7 @@
           </w:p>
           <w:p>
             <w:pPr>
+              <w:keepNext w:val="false"/>
               <w:spacing w:after="40"/>
               <w:ind w:left="240"/>
             </w:pPr>
@@ -6495,6 +6734,7 @@
           </w:p>
           <w:p>
             <w:pPr>
+              <w:keepNext w:val="false"/>
               <w:spacing w:after="40"/>
               <w:ind w:left="240"/>
             </w:pPr>
@@ -6519,6 +6759,7 @@
           </w:p>
           <w:p>
             <w:pPr>
+              <w:keepNext w:val="false"/>
               <w:spacing w:after="40"/>
               <w:ind w:left="240"/>
             </w:pPr>
@@ -6546,6 +6787,7 @@
     </w:tbl>
     <w:p>
       <w:pPr>
+        <w:keepNext w:val="false"/>
         <w:spacing w:after="100"/>
       </w:pPr>
     </w:p>
@@ -6586,6 +6828,7 @@
           </w:tcPr>
           <w:p>
             <w:pPr>
+              <w:keepNext w:val="false"/>
               <w:spacing w:after="60"/>
             </w:pPr>
             <w:r>
@@ -6609,6 +6852,7 @@
           </w:p>
           <w:p>
             <w:pPr>
+              <w:keepNext w:val="false"/>
               <w:spacing w:after="80"/>
             </w:pPr>
             <w:r>
@@ -6622,6 +6866,7 @@
           </w:p>
           <w:p>
             <w:pPr>
+              <w:keepNext w:val="false"/>
               <w:spacing w:after="40"/>
               <w:ind w:left="240"/>
             </w:pPr>
@@ -6646,6 +6891,7 @@
           </w:p>
           <w:p>
             <w:pPr>
+              <w:keepNext w:val="false"/>
               <w:spacing w:after="40"/>
               <w:ind w:left="240"/>
             </w:pPr>
@@ -6670,6 +6916,7 @@
           </w:p>
           <w:p>
             <w:pPr>
+              <w:keepNext w:val="false"/>
               <w:spacing w:after="40"/>
               <w:ind w:left="240"/>
             </w:pPr>
@@ -6694,6 +6941,7 @@
           </w:p>
           <w:p>
             <w:pPr>
+              <w:keepNext w:val="false"/>
               <w:spacing w:after="40"/>
               <w:ind w:left="240"/>
             </w:pPr>
@@ -6721,6 +6969,7 @@
     </w:tbl>
     <w:p>
       <w:pPr>
+        <w:keepNext w:val="false"/>
         <w:spacing w:after="100"/>
       </w:pPr>
     </w:p>
@@ -6761,6 +7010,7 @@
           </w:tcPr>
           <w:p>
             <w:pPr>
+              <w:keepNext w:val="false"/>
               <w:spacing w:after="60"/>
             </w:pPr>
             <w:r>
@@ -6784,6 +7034,7 @@
           </w:p>
           <w:p>
             <w:pPr>
+              <w:keepNext w:val="false"/>
               <w:spacing w:after="80"/>
             </w:pPr>
             <w:r>
@@ -6797,6 +7048,7 @@
           </w:p>
           <w:p>
             <w:pPr>
+              <w:keepNext w:val="false"/>
               <w:spacing w:after="40"/>
               <w:ind w:left="240"/>
             </w:pPr>
@@ -6821,6 +7073,7 @@
           </w:p>
           <w:p>
             <w:pPr>
+              <w:keepNext w:val="false"/>
               <w:spacing w:after="40"/>
               <w:ind w:left="240"/>
             </w:pPr>
@@ -6845,6 +7098,7 @@
           </w:p>
           <w:p>
             <w:pPr>
+              <w:keepNext w:val="false"/>
               <w:spacing w:after="40"/>
               <w:ind w:left="240"/>
             </w:pPr>
@@ -6869,6 +7123,7 @@
           </w:p>
           <w:p>
             <w:pPr>
+              <w:keepNext w:val="false"/>
               <w:spacing w:after="40"/>
               <w:ind w:left="240"/>
             </w:pPr>
@@ -6896,6 +7151,7 @@
     </w:tbl>
     <w:p>
       <w:pPr>
+        <w:keepNext w:val="false"/>
         <w:spacing w:after="100"/>
       </w:pPr>
     </w:p>
@@ -6936,6 +7192,7 @@
           </w:tcPr>
           <w:p>
             <w:pPr>
+              <w:keepNext w:val="false"/>
               <w:spacing w:after="60"/>
             </w:pPr>
             <w:r>
@@ -6959,6 +7216,7 @@
           </w:p>
           <w:p>
             <w:pPr>
+              <w:keepNext w:val="false"/>
               <w:spacing w:after="80"/>
             </w:pPr>
             <w:r>
@@ -6972,6 +7230,7 @@
           </w:p>
           <w:p>
             <w:pPr>
+              <w:keepNext w:val="false"/>
               <w:spacing w:after="40"/>
               <w:ind w:left="240"/>
             </w:pPr>
@@ -6996,6 +7255,7 @@
           </w:p>
           <w:p>
             <w:pPr>
+              <w:keepNext w:val="false"/>
               <w:spacing w:after="40"/>
               <w:ind w:left="240"/>
             </w:pPr>
@@ -7020,6 +7280,7 @@
           </w:p>
           <w:p>
             <w:pPr>
+              <w:keepNext w:val="false"/>
               <w:spacing w:after="40"/>
               <w:ind w:left="240"/>
             </w:pPr>
@@ -7044,6 +7305,7 @@
           </w:p>
           <w:p>
             <w:pPr>
+              <w:keepNext w:val="false"/>
               <w:spacing w:after="40"/>
               <w:ind w:left="240"/>
             </w:pPr>
@@ -7071,6 +7333,7 @@
     </w:tbl>
     <w:p>
       <w:pPr>
+        <w:keepNext w:val="false"/>
         <w:spacing w:after="100"/>
       </w:pPr>
     </w:p>
@@ -7111,6 +7374,7 @@
           </w:tcPr>
           <w:p>
             <w:pPr>
+              <w:keepNext w:val="false"/>
               <w:spacing w:after="60"/>
             </w:pPr>
             <w:r>
@@ -7134,6 +7398,7 @@
           </w:p>
           <w:p>
             <w:pPr>
+              <w:keepNext w:val="false"/>
               <w:spacing w:after="80"/>
             </w:pPr>
             <w:r>
@@ -7147,6 +7412,7 @@
           </w:p>
           <w:p>
             <w:pPr>
+              <w:keepNext w:val="false"/>
               <w:spacing w:after="40"/>
               <w:ind w:left="240"/>
             </w:pPr>
@@ -7171,6 +7437,7 @@
           </w:p>
           <w:p>
             <w:pPr>
+              <w:keepNext w:val="false"/>
               <w:spacing w:after="40"/>
               <w:ind w:left="240"/>
             </w:pPr>
@@ -7195,6 +7462,7 @@
           </w:p>
           <w:p>
             <w:pPr>
+              <w:keepNext w:val="false"/>
               <w:spacing w:after="40"/>
               <w:ind w:left="240"/>
             </w:pPr>
@@ -7219,6 +7487,7 @@
           </w:p>
           <w:p>
             <w:pPr>
+              <w:keepNext w:val="false"/>
               <w:spacing w:after="40"/>
               <w:ind w:left="240"/>
             </w:pPr>
@@ -7246,6 +7515,7 @@
     </w:tbl>
     <w:p>
       <w:pPr>
+        <w:keepNext w:val="false"/>
         <w:spacing w:after="100"/>
       </w:pPr>
     </w:p>
@@ -7287,6 +7557,7 @@
           </w:tcPr>
           <w:p>
             <w:pPr>
+              <w:keepNext/>
               <w:spacing w:after="80"/>
             </w:pPr>
             <w:r>
@@ -7302,6 +7573,7 @@
           </w:p>
           <w:p>
             <w:pPr>
+              <w:keepNext/>
               <w:spacing w:after="80"/>
             </w:pPr>
             <w:r>
@@ -7315,6 +7587,7 @@
           </w:p>
           <w:p>
             <w:pPr>
+              <w:keepNext/>
               <w:spacing w:after="80"/>
             </w:pPr>
             <w:r>
@@ -7377,6 +7650,7 @@
                 </w:tcPr>
                 <w:p>
                   <w:pPr>
+                    <w:keepNext/>
                     <w:spacing w:after="80"/>
                   </w:pPr>
                   <w:r>
@@ -7410,6 +7684,7 @@
                 </w:tcPr>
                 <w:p>
                   <w:pPr>
+                    <w:keepNext/>
                     <w:spacing w:after="80"/>
                   </w:pPr>
                   <w:r>
@@ -7444,6 +7719,7 @@
                 </w:tcPr>
                 <w:p>
                   <w:pPr>
+                    <w:keepNext/>
                     <w:spacing w:after="80"/>
                   </w:pPr>
                   <w:r>
@@ -7474,6 +7750,7 @@
                 </w:tcPr>
                 <w:p>
                   <w:pPr>
+                    <w:keepNext/>
                     <w:spacing w:after="80"/>
                   </w:pPr>
                   <w:r>
@@ -7507,6 +7784,7 @@
                 </w:tcPr>
                 <w:p>
                   <w:pPr>
+                    <w:keepNext/>
                     <w:spacing w:after="80"/>
                   </w:pPr>
                   <w:r>
@@ -7538,6 +7816,7 @@
                 </w:tcPr>
                 <w:p>
                   <w:pPr>
+                    <w:keepNext/>
                     <w:spacing w:after="80"/>
                   </w:pPr>
                   <w:r>
@@ -7570,6 +7849,7 @@
                 </w:tcPr>
                 <w:p>
                   <w:pPr>
+                    <w:keepNext/>
                     <w:spacing w:after="80"/>
                   </w:pPr>
                   <w:r>
@@ -7600,6 +7880,7 @@
                 </w:tcPr>
                 <w:p>
                   <w:pPr>
+                    <w:keepNext/>
                     <w:spacing w:after="80"/>
                   </w:pPr>
                   <w:r>
@@ -7633,6 +7914,7 @@
                 </w:tcPr>
                 <w:p>
                   <w:pPr>
+                    <w:keepNext/>
                     <w:spacing w:after="80"/>
                   </w:pPr>
                   <w:r>
@@ -7664,6 +7946,7 @@
                 </w:tcPr>
                 <w:p>
                   <w:pPr>
+                    <w:keepNext/>
                     <w:spacing w:after="80"/>
                   </w:pPr>
                   <w:r>
@@ -7696,6 +7979,7 @@
                 </w:tcPr>
                 <w:p>
                   <w:pPr>
+                    <w:keepNext/>
                     <w:spacing w:after="80"/>
                   </w:pPr>
                   <w:r>
@@ -7726,6 +8010,7 @@
                 </w:tcPr>
                 <w:p>
                   <w:pPr>
+                    <w:keepNext/>
                     <w:spacing w:after="80"/>
                   </w:pPr>
                   <w:r>
@@ -7759,6 +8044,7 @@
                 </w:tcPr>
                 <w:p>
                   <w:pPr>
+                    <w:keepNext/>
                     <w:spacing w:after="80"/>
                   </w:pPr>
                   <w:r>
@@ -7790,6 +8076,7 @@
                 </w:tcPr>
                 <w:p>
                   <w:pPr>
+                    <w:keepNext/>
                     <w:spacing w:after="80"/>
                   </w:pPr>
                   <w:r>
@@ -7810,6 +8097,7 @@
     </w:tbl>
     <w:p>
       <w:pPr>
+        <w:keepNext/>
         <w:spacing w:after="100"/>
       </w:pPr>
     </w:p>
@@ -7850,6 +8138,7 @@
           </w:tcPr>
           <w:p>
             <w:pPr>
+              <w:keepNext w:val="false"/>
               <w:spacing w:after="60"/>
             </w:pPr>
             <w:r>
@@ -7873,6 +8162,7 @@
           </w:p>
           <w:p>
             <w:pPr>
+              <w:keepNext w:val="false"/>
               <w:spacing w:after="80"/>
             </w:pPr>
             <w:r>
@@ -7886,6 +8176,7 @@
           </w:p>
           <w:p>
             <w:pPr>
+              <w:keepNext w:val="false"/>
               <w:spacing w:before="80"/>
             </w:pPr>
             <w:r>
@@ -7902,6 +8193,7 @@
     </w:tbl>
     <w:p>
       <w:pPr>
+        <w:keepNext w:val="false"/>
         <w:spacing w:after="100"/>
       </w:pPr>
     </w:p>
@@ -7942,6 +8234,7 @@
           </w:tcPr>
           <w:p>
             <w:pPr>
+              <w:keepNext w:val="false"/>
               <w:spacing w:after="60"/>
             </w:pPr>
             <w:r>
@@ -7965,6 +8258,7 @@
           </w:p>
           <w:p>
             <w:pPr>
+              <w:keepNext w:val="false"/>
               <w:spacing w:after="80"/>
             </w:pPr>
             <w:r>
@@ -7978,6 +8272,7 @@
           </w:p>
           <w:p>
             <w:pPr>
+              <w:keepNext w:val="false"/>
               <w:spacing w:before="80"/>
             </w:pPr>
             <w:r>
@@ -7994,6 +8289,7 @@
     </w:tbl>
     <w:p>
       <w:pPr>
+        <w:keepNext w:val="false"/>
         <w:spacing w:after="100"/>
       </w:pPr>
     </w:p>
@@ -8034,6 +8330,7 @@
           </w:tcPr>
           <w:p>
             <w:pPr>
+              <w:keepNext w:val="false"/>
               <w:spacing w:after="60"/>
             </w:pPr>
             <w:r>
@@ -8057,6 +8354,7 @@
           </w:p>
           <w:p>
             <w:pPr>
+              <w:keepNext w:val="false"/>
               <w:spacing w:after="80"/>
             </w:pPr>
             <w:r>
@@ -8070,6 +8368,7 @@
           </w:p>
           <w:p>
             <w:pPr>
+              <w:keepNext w:val="false"/>
               <w:spacing w:after="40"/>
               <w:ind w:left="240"/>
             </w:pPr>
@@ -8094,6 +8393,7 @@
           </w:p>
           <w:p>
             <w:pPr>
+              <w:keepNext w:val="false"/>
               <w:spacing w:after="40"/>
               <w:ind w:left="240"/>
             </w:pPr>
@@ -8118,6 +8418,7 @@
           </w:p>
           <w:p>
             <w:pPr>
+              <w:keepNext w:val="false"/>
               <w:spacing w:after="40"/>
               <w:ind w:left="240"/>
             </w:pPr>
@@ -8142,6 +8443,7 @@
           </w:p>
           <w:p>
             <w:pPr>
+              <w:keepNext w:val="false"/>
               <w:spacing w:after="40"/>
               <w:ind w:left="240"/>
             </w:pPr>
@@ -8169,6 +8471,7 @@
     </w:tbl>
     <w:p>
       <w:pPr>
+        <w:keepNext w:val="false"/>
         <w:spacing w:after="100"/>
       </w:pPr>
     </w:p>
@@ -8209,6 +8512,7 @@
           </w:tcPr>
           <w:p>
             <w:pPr>
+              <w:keepNext w:val="false"/>
               <w:spacing w:after="60"/>
             </w:pPr>
             <w:r>
@@ -8232,6 +8536,7 @@
           </w:p>
           <w:p>
             <w:pPr>
+              <w:keepNext w:val="false"/>
               <w:spacing w:after="80"/>
             </w:pPr>
             <w:r>
@@ -8245,6 +8550,7 @@
           </w:p>
           <w:p>
             <w:pPr>
+              <w:keepNext w:val="false"/>
               <w:spacing w:after="40"/>
               <w:ind w:left="240"/>
             </w:pPr>
@@ -8269,6 +8575,7 @@
           </w:p>
           <w:p>
             <w:pPr>
+              <w:keepNext w:val="false"/>
               <w:spacing w:after="40"/>
               <w:ind w:left="240"/>
             </w:pPr>
@@ -8293,6 +8600,7 @@
           </w:p>
           <w:p>
             <w:pPr>
+              <w:keepNext w:val="false"/>
               <w:spacing w:after="40"/>
               <w:ind w:left="240"/>
             </w:pPr>
@@ -8317,6 +8625,7 @@
           </w:p>
           <w:p>
             <w:pPr>
+              <w:keepNext w:val="false"/>
               <w:spacing w:after="40"/>
               <w:ind w:left="240"/>
             </w:pPr>
@@ -8344,6 +8653,7 @@
     </w:tbl>
     <w:p>
       <w:pPr>
+        <w:keepNext w:val="false"/>
         <w:spacing w:after="100"/>
       </w:pPr>
     </w:p>
@@ -8384,6 +8694,7 @@
           </w:tcPr>
           <w:p>
             <w:pPr>
+              <w:keepNext w:val="false"/>
               <w:spacing w:after="60"/>
             </w:pPr>
             <w:r>
@@ -8407,6 +8718,7 @@
           </w:p>
           <w:p>
             <w:pPr>
+              <w:keepNext w:val="false"/>
               <w:spacing w:after="80"/>
             </w:pPr>
             <w:r>
@@ -8420,6 +8732,7 @@
           </w:p>
           <w:p>
             <w:pPr>
+              <w:keepNext w:val="false"/>
               <w:spacing w:after="900" w:before="80"/>
             </w:pPr>
             <w:r>
@@ -8433,6 +8746,7 @@
           </w:p>
           <w:p>
             <w:pPr>
+              <w:keepNext w:val="false"/>
               <w:spacing w:after="80"/>
             </w:pPr>
             <w:r>
@@ -8449,6 +8763,7 @@
     </w:tbl>
     <w:p>
       <w:pPr>
+        <w:keepNext w:val="false"/>
         <w:spacing w:after="100"/>
       </w:pPr>
     </w:p>
@@ -8489,6 +8804,7 @@
           </w:tcPr>
           <w:p>
             <w:pPr>
+              <w:keepNext w:val="false"/>
               <w:spacing w:after="60"/>
             </w:pPr>
             <w:r>
@@ -8512,6 +8828,7 @@
           </w:p>
           <w:p>
             <w:pPr>
+              <w:keepNext w:val="false"/>
               <w:spacing w:after="80"/>
             </w:pPr>
             <w:r>
@@ -8525,6 +8842,7 @@
           </w:p>
           <w:p>
             <w:pPr>
+              <w:keepNext w:val="false"/>
               <w:spacing w:after="900" w:before="80"/>
             </w:pPr>
             <w:r>
@@ -8538,6 +8856,7 @@
           </w:p>
           <w:p>
             <w:pPr>
+              <w:keepNext w:val="false"/>
               <w:spacing w:after="80"/>
             </w:pPr>
             <w:r>
@@ -8569,6 +8888,7 @@
     </w:p>
     <w:p>
       <w:pPr>
+        <w:keepNext w:val="false"/>
         <w:spacing w:after="100"/>
       </w:pPr>
       <w:r>
@@ -8582,6 +8902,7 @@
     </w:p>
     <w:p>
       <w:pPr>
+        <w:keepNext w:val="false"/>
         <w:spacing w:after="160"/>
       </w:pPr>
       <w:r>
@@ -8630,6 +8951,7 @@
           </w:tcPr>
           <w:p>
             <w:pPr>
+              <w:keepNext w:val="false"/>
               <w:spacing w:after="60"/>
             </w:pPr>
             <w:r>
@@ -8653,6 +8975,7 @@
           </w:p>
           <w:p>
             <w:pPr>
+              <w:keepNext w:val="false"/>
               <w:spacing w:after="80"/>
             </w:pPr>
             <w:r>
@@ -8666,6 +8989,7 @@
           </w:p>
           <w:p>
             <w:pPr>
+              <w:keepNext w:val="false"/>
               <w:spacing w:after="40"/>
               <w:ind w:left="240"/>
             </w:pPr>
@@ -8690,6 +9014,7 @@
           </w:p>
           <w:p>
             <w:pPr>
+              <w:keepNext w:val="false"/>
               <w:spacing w:after="40"/>
               <w:ind w:left="240"/>
             </w:pPr>
@@ -8714,6 +9039,7 @@
           </w:p>
           <w:p>
             <w:pPr>
+              <w:keepNext w:val="false"/>
               <w:spacing w:after="40"/>
               <w:ind w:left="240"/>
             </w:pPr>
@@ -8738,6 +9064,7 @@
           </w:p>
           <w:p>
             <w:pPr>
+              <w:keepNext w:val="false"/>
               <w:spacing w:after="40"/>
               <w:ind w:left="240"/>
             </w:pPr>
@@ -8765,6 +9092,7 @@
     </w:tbl>
     <w:p>
       <w:pPr>
+        <w:keepNext w:val="false"/>
         <w:spacing w:after="100"/>
       </w:pPr>
     </w:p>
@@ -8805,6 +9133,7 @@
           </w:tcPr>
           <w:p>
             <w:pPr>
+              <w:keepNext w:val="false"/>
               <w:spacing w:after="60"/>
             </w:pPr>
             <w:r>
@@ -8828,6 +9157,7 @@
           </w:p>
           <w:p>
             <w:pPr>
+              <w:keepNext w:val="false"/>
               <w:spacing w:after="80"/>
             </w:pPr>
             <w:r>
@@ -8841,6 +9171,7 @@
           </w:p>
           <w:p>
             <w:pPr>
+              <w:keepNext w:val="false"/>
               <w:spacing w:after="40"/>
               <w:ind w:left="240"/>
             </w:pPr>
@@ -8865,6 +9196,7 @@
           </w:p>
           <w:p>
             <w:pPr>
+              <w:keepNext w:val="false"/>
               <w:spacing w:after="40"/>
               <w:ind w:left="240"/>
             </w:pPr>
@@ -8889,6 +9221,7 @@
           </w:p>
           <w:p>
             <w:pPr>
+              <w:keepNext w:val="false"/>
               <w:spacing w:after="40"/>
               <w:ind w:left="240"/>
             </w:pPr>
@@ -8913,6 +9246,7 @@
           </w:p>
           <w:p>
             <w:pPr>
+              <w:keepNext w:val="false"/>
               <w:spacing w:after="40"/>
               <w:ind w:left="240"/>
             </w:pPr>
@@ -8940,6 +9274,7 @@
     </w:tbl>
     <w:p>
       <w:pPr>
+        <w:keepNext w:val="false"/>
         <w:spacing w:after="100"/>
       </w:pPr>
     </w:p>
@@ -8980,6 +9315,7 @@
           </w:tcPr>
           <w:p>
             <w:pPr>
+              <w:keepNext w:val="false"/>
               <w:spacing w:after="60"/>
             </w:pPr>
             <w:r>
@@ -9003,6 +9339,7 @@
           </w:p>
           <w:p>
             <w:pPr>
+              <w:keepNext w:val="false"/>
               <w:spacing w:after="80"/>
             </w:pPr>
             <w:r>
@@ -9016,6 +9353,7 @@
           </w:p>
           <w:p>
             <w:pPr>
+              <w:keepNext w:val="false"/>
               <w:spacing w:after="40"/>
               <w:ind w:left="240"/>
             </w:pPr>
@@ -9040,6 +9378,7 @@
           </w:p>
           <w:p>
             <w:pPr>
+              <w:keepNext w:val="false"/>
               <w:spacing w:after="40"/>
               <w:ind w:left="240"/>
             </w:pPr>
@@ -9064,6 +9403,7 @@
           </w:p>
           <w:p>
             <w:pPr>
+              <w:keepNext w:val="false"/>
               <w:spacing w:after="40"/>
               <w:ind w:left="240"/>
             </w:pPr>
@@ -9088,6 +9428,7 @@
           </w:p>
           <w:p>
             <w:pPr>
+              <w:keepNext w:val="false"/>
               <w:spacing w:after="40"/>
               <w:ind w:left="240"/>
             </w:pPr>
@@ -9115,6 +9456,7 @@
     </w:tbl>
     <w:p>
       <w:pPr>
+        <w:keepNext w:val="false"/>
         <w:spacing w:after="100"/>
       </w:pPr>
     </w:p>
@@ -9155,6 +9497,7 @@
           </w:tcPr>
           <w:p>
             <w:pPr>
+              <w:keepNext w:val="false"/>
               <w:spacing w:after="60"/>
             </w:pPr>
             <w:r>
@@ -9178,6 +9521,7 @@
           </w:p>
           <w:p>
             <w:pPr>
+              <w:keepNext w:val="false"/>
               <w:spacing w:after="80"/>
             </w:pPr>
             <w:r>
@@ -9191,6 +9535,7 @@
           </w:p>
           <w:p>
             <w:pPr>
+              <w:keepNext w:val="false"/>
               <w:spacing w:after="40"/>
               <w:ind w:left="240"/>
             </w:pPr>
@@ -9215,6 +9560,7 @@
           </w:p>
           <w:p>
             <w:pPr>
+              <w:keepNext w:val="false"/>
               <w:spacing w:after="40"/>
               <w:ind w:left="240"/>
             </w:pPr>
@@ -9239,6 +9585,7 @@
           </w:p>
           <w:p>
             <w:pPr>
+              <w:keepNext w:val="false"/>
               <w:spacing w:after="40"/>
               <w:ind w:left="240"/>
             </w:pPr>
@@ -9263,6 +9610,7 @@
           </w:p>
           <w:p>
             <w:pPr>
+              <w:keepNext w:val="false"/>
               <w:spacing w:after="40"/>
               <w:ind w:left="240"/>
             </w:pPr>
@@ -9290,6 +9638,7 @@
     </w:tbl>
     <w:p>
       <w:pPr>
+        <w:keepNext w:val="false"/>
         <w:spacing w:after="100"/>
       </w:pPr>
     </w:p>
@@ -9330,6 +9679,7 @@
           </w:tcPr>
           <w:p>
             <w:pPr>
+              <w:keepNext w:val="false"/>
               <w:spacing w:after="60"/>
             </w:pPr>
             <w:r>
@@ -9353,6 +9703,7 @@
           </w:p>
           <w:p>
             <w:pPr>
+              <w:keepNext w:val="false"/>
               <w:spacing w:after="80"/>
             </w:pPr>
             <w:r>
@@ -9366,6 +9717,7 @@
           </w:p>
           <w:p>
             <w:pPr>
+              <w:keepNext w:val="false"/>
               <w:spacing w:after="40"/>
               <w:ind w:left="240"/>
             </w:pPr>
@@ -9390,6 +9742,7 @@
           </w:p>
           <w:p>
             <w:pPr>
+              <w:keepNext w:val="false"/>
               <w:spacing w:after="40"/>
               <w:ind w:left="240"/>
             </w:pPr>
@@ -9414,6 +9767,7 @@
           </w:p>
           <w:p>
             <w:pPr>
+              <w:keepNext w:val="false"/>
               <w:spacing w:after="40"/>
               <w:ind w:left="240"/>
             </w:pPr>
@@ -9438,6 +9792,7 @@
           </w:p>
           <w:p>
             <w:pPr>
+              <w:keepNext w:val="false"/>
               <w:spacing w:after="40"/>
               <w:ind w:left="240"/>
             </w:pPr>
@@ -9465,6 +9820,7 @@
     </w:tbl>
     <w:p>
       <w:pPr>
+        <w:keepNext w:val="false"/>
         <w:spacing w:after="100"/>
       </w:pPr>
     </w:p>
@@ -9505,6 +9861,7 @@
           </w:tcPr>
           <w:p>
             <w:pPr>
+              <w:keepNext w:val="false"/>
               <w:spacing w:after="60"/>
             </w:pPr>
             <w:r>
@@ -9528,6 +9885,7 @@
           </w:p>
           <w:p>
             <w:pPr>
+              <w:keepNext w:val="false"/>
               <w:spacing w:after="80"/>
             </w:pPr>
             <w:r>
@@ -9541,6 +9899,7 @@
           </w:p>
           <w:p>
             <w:pPr>
+              <w:keepNext w:val="false"/>
               <w:spacing w:after="40"/>
               <w:ind w:left="240"/>
             </w:pPr>
@@ -9565,6 +9924,7 @@
           </w:p>
           <w:p>
             <w:pPr>
+              <w:keepNext w:val="false"/>
               <w:spacing w:after="40"/>
               <w:ind w:left="240"/>
             </w:pPr>
@@ -9589,6 +9949,7 @@
           </w:p>
           <w:p>
             <w:pPr>
+              <w:keepNext w:val="false"/>
               <w:spacing w:after="40"/>
               <w:ind w:left="240"/>
             </w:pPr>
@@ -9613,6 +9974,7 @@
           </w:p>
           <w:p>
             <w:pPr>
+              <w:keepNext w:val="false"/>
               <w:spacing w:after="40"/>
               <w:ind w:left="240"/>
             </w:pPr>
@@ -9640,6 +10002,7 @@
     </w:tbl>
     <w:p>
       <w:pPr>
+        <w:keepNext w:val="false"/>
         <w:spacing w:after="100"/>
       </w:pPr>
     </w:p>
@@ -9681,6 +10044,7 @@
           </w:tcPr>
           <w:p>
             <w:pPr>
+              <w:keepNext/>
               <w:spacing w:after="80"/>
             </w:pPr>
             <w:r>
@@ -9696,6 +10060,7 @@
           </w:p>
           <w:p>
             <w:pPr>
+              <w:keepNext/>
               <w:spacing w:after="80"/>
             </w:pPr>
             <w:r>
@@ -9709,6 +10074,7 @@
           </w:p>
           <w:p>
             <w:pPr>
+              <w:keepNext/>
               <w:spacing w:after="80"/>
             </w:pPr>
             <w:r>
@@ -9734,6 +10100,7 @@
           </w:p>
           <w:p>
             <w:pPr>
+              <w:keepNext/>
               <w:spacing w:after="60" w:before="60"/>
               <w:jc w:val="center"/>
             </w:pPr>
@@ -9783,6 +10150,7 @@
     </w:tbl>
     <w:p>
       <w:pPr>
+        <w:keepNext/>
         <w:spacing w:after="100"/>
       </w:pPr>
     </w:p>
@@ -9823,6 +10191,7 @@
           </w:tcPr>
           <w:p>
             <w:pPr>
+              <w:keepNext w:val="false"/>
               <w:spacing w:after="60"/>
             </w:pPr>
             <w:r>
@@ -9846,6 +10215,7 @@
           </w:p>
           <w:p>
             <w:pPr>
+              <w:keepNext w:val="false"/>
               <w:spacing w:after="80"/>
             </w:pPr>
             <w:r>
@@ -9859,6 +10229,7 @@
           </w:p>
           <w:p>
             <w:pPr>
+              <w:keepNext w:val="false"/>
               <w:spacing w:before="80"/>
             </w:pPr>
             <w:r>
@@ -9875,6 +10246,7 @@
     </w:tbl>
     <w:p>
       <w:pPr>
+        <w:keepNext w:val="false"/>
         <w:spacing w:after="100"/>
       </w:pPr>
     </w:p>
@@ -9915,6 +10287,7 @@
           </w:tcPr>
           <w:p>
             <w:pPr>
+              <w:keepNext w:val="false"/>
               <w:spacing w:after="60"/>
             </w:pPr>
             <w:r>
@@ -9938,6 +10311,7 @@
           </w:p>
           <w:p>
             <w:pPr>
+              <w:keepNext w:val="false"/>
               <w:spacing w:after="80"/>
             </w:pPr>
             <w:r>
@@ -9951,6 +10325,7 @@
           </w:p>
           <w:p>
             <w:pPr>
+              <w:keepNext w:val="false"/>
               <w:spacing w:after="40"/>
               <w:ind w:left="240"/>
             </w:pPr>
@@ -9975,6 +10350,7 @@
           </w:p>
           <w:p>
             <w:pPr>
+              <w:keepNext w:val="false"/>
               <w:spacing w:after="40"/>
               <w:ind w:left="240"/>
             </w:pPr>
@@ -9999,6 +10375,7 @@
           </w:p>
           <w:p>
             <w:pPr>
+              <w:keepNext w:val="false"/>
               <w:spacing w:after="40"/>
               <w:ind w:left="240"/>
             </w:pPr>
@@ -10023,6 +10400,7 @@
           </w:p>
           <w:p>
             <w:pPr>
+              <w:keepNext w:val="false"/>
               <w:spacing w:after="40"/>
               <w:ind w:left="240"/>
             </w:pPr>
@@ -10050,6 +10428,7 @@
     </w:tbl>
     <w:p>
       <w:pPr>
+        <w:keepNext w:val="false"/>
         <w:spacing w:after="100"/>
       </w:pPr>
     </w:p>
@@ -10090,6 +10469,7 @@
           </w:tcPr>
           <w:p>
             <w:pPr>
+              <w:keepNext w:val="false"/>
               <w:spacing w:after="60"/>
             </w:pPr>
             <w:r>
@@ -10113,6 +10493,7 @@
           </w:p>
           <w:p>
             <w:pPr>
+              <w:keepNext w:val="false"/>
               <w:spacing w:after="80"/>
             </w:pPr>
             <w:r>
@@ -10126,6 +10507,7 @@
           </w:p>
           <w:p>
             <w:pPr>
+              <w:keepNext w:val="false"/>
               <w:spacing w:before="80"/>
             </w:pPr>
             <w:r>
@@ -10142,6 +10524,7 @@
     </w:tbl>
     <w:p>
       <w:pPr>
+        <w:keepNext w:val="false"/>
         <w:spacing w:after="100"/>
       </w:pPr>
     </w:p>
@@ -10182,6 +10565,7 @@
           </w:tcPr>
           <w:p>
             <w:pPr>
+              <w:keepNext w:val="false"/>
               <w:spacing w:after="60"/>
             </w:pPr>
             <w:r>
@@ -10205,6 +10589,7 @@
           </w:p>
           <w:p>
             <w:pPr>
+              <w:keepNext w:val="false"/>
               <w:spacing w:after="80"/>
             </w:pPr>
             <w:r>
@@ -10218,6 +10603,7 @@
           </w:p>
           <w:p>
             <w:pPr>
+              <w:keepNext w:val="false"/>
               <w:spacing w:after="40"/>
               <w:ind w:left="240"/>
             </w:pPr>
@@ -10242,6 +10628,7 @@
           </w:p>
           <w:p>
             <w:pPr>
+              <w:keepNext w:val="false"/>
               <w:spacing w:after="40"/>
               <w:ind w:left="240"/>
             </w:pPr>
@@ -10266,6 +10653,7 @@
           </w:p>
           <w:p>
             <w:pPr>
+              <w:keepNext w:val="false"/>
               <w:spacing w:after="40"/>
               <w:ind w:left="240"/>
             </w:pPr>
@@ -10290,6 +10678,7 @@
           </w:p>
           <w:p>
             <w:pPr>
+              <w:keepNext w:val="false"/>
               <w:spacing w:after="40"/>
               <w:ind w:left="240"/>
             </w:pPr>
@@ -10317,6 +10706,7 @@
     </w:tbl>
     <w:p>
       <w:pPr>
+        <w:keepNext w:val="false"/>
         <w:spacing w:after="100"/>
       </w:pPr>
     </w:p>
@@ -10357,6 +10747,7 @@
           </w:tcPr>
           <w:p>
             <w:pPr>
+              <w:keepNext w:val="false"/>
               <w:spacing w:after="60"/>
             </w:pPr>
             <w:r>
@@ -10380,6 +10771,7 @@
           </w:p>
           <w:p>
             <w:pPr>
+              <w:keepNext w:val="false"/>
               <w:spacing w:after="80"/>
             </w:pPr>
             <w:r>
@@ -10393,6 +10785,7 @@
           </w:p>
           <w:p>
             <w:pPr>
+              <w:keepNext w:val="false"/>
               <w:spacing w:after="900" w:before="80"/>
             </w:pPr>
             <w:r>
@@ -10406,6 +10799,7 @@
           </w:p>
           <w:p>
             <w:pPr>
+              <w:keepNext w:val="false"/>
               <w:spacing w:after="80"/>
             </w:pPr>
             <w:r>
@@ -10422,6 +10816,7 @@
     </w:tbl>
     <w:p>
       <w:pPr>
+        <w:keepNext w:val="false"/>
         <w:spacing w:after="100"/>
       </w:pPr>
     </w:p>
@@ -10462,6 +10857,7 @@
           </w:tcPr>
           <w:p>
             <w:pPr>
+              <w:keepNext w:val="false"/>
               <w:spacing w:after="60"/>
             </w:pPr>
             <w:r>
@@ -10485,6 +10881,7 @@
           </w:p>
           <w:p>
             <w:pPr>
+              <w:keepNext w:val="false"/>
               <w:spacing w:after="80"/>
             </w:pPr>
             <w:r>
@@ -10498,6 +10895,7 @@
           </w:p>
           <w:p>
             <w:pPr>
+              <w:keepNext w:val="false"/>
               <w:spacing w:after="40"/>
               <w:ind w:left="240"/>
             </w:pPr>
@@ -10522,6 +10920,7 @@
           </w:p>
           <w:p>
             <w:pPr>
+              <w:keepNext w:val="false"/>
               <w:spacing w:after="40"/>
               <w:ind w:left="240"/>
             </w:pPr>
@@ -10546,6 +10945,7 @@
           </w:p>
           <w:p>
             <w:pPr>
+              <w:keepNext w:val="false"/>
               <w:spacing w:after="40"/>
               <w:ind w:left="240"/>
             </w:pPr>
@@ -10570,6 +10970,7 @@
           </w:p>
           <w:p>
             <w:pPr>
+              <w:keepNext w:val="false"/>
               <w:spacing w:before="80"/>
             </w:pPr>
             <w:r>
@@ -10601,6 +11002,7 @@
     </w:p>
     <w:p>
       <w:pPr>
+        <w:keepNext w:val="false"/>
         <w:spacing w:after="100"/>
       </w:pPr>
       <w:r>
@@ -10614,6 +11016,7 @@
     </w:p>
     <w:p>
       <w:pPr>
+        <w:keepNext w:val="false"/>
         <w:spacing w:after="160"/>
       </w:pPr>
       <w:r>
@@ -10663,6 +11066,7 @@
           </w:tcPr>
           <w:p>
             <w:pPr>
+              <w:keepNext/>
               <w:spacing w:after="80"/>
             </w:pPr>
             <w:r>
@@ -10724,6 +11128,7 @@
                 </w:tcPr>
                 <w:p>
                   <w:pPr>
+                    <w:keepNext/>
                     <w:spacing w:after="0"/>
                   </w:pPr>
                   <w:r>
@@ -10738,6 +11143,7 @@
                 </w:p>
                 <w:p>
                   <w:pPr>
+                    <w:keepNext/>
                     <w:spacing w:after="0"/>
                   </w:pPr>
                   <w:r>
@@ -10752,6 +11158,7 @@
                 </w:p>
                 <w:p>
                   <w:pPr>
+                    <w:keepNext/>
                     <w:spacing w:after="0"/>
                   </w:pPr>
                   <w:r>
@@ -10766,6 +11173,7 @@
                 </w:p>
                 <w:p>
                   <w:pPr>
+                    <w:keepNext/>
                     <w:spacing w:after="0"/>
                   </w:pPr>
                   <w:r>
@@ -10780,6 +11188,7 @@
                 </w:p>
                 <w:p>
                   <w:pPr>
+                    <w:keepNext/>
                     <w:spacing w:after="0"/>
                   </w:pPr>
                   <w:r>
@@ -10794,6 +11203,7 @@
                 </w:p>
                 <w:p>
                   <w:pPr>
+                    <w:keepNext/>
                     <w:spacing w:after="0"/>
                   </w:pPr>
                   <w:r>
@@ -10808,6 +11218,7 @@
                 </w:p>
                 <w:p>
                   <w:pPr>
+                    <w:keepNext/>
                     <w:spacing w:after="0"/>
                   </w:pPr>
                   <w:r>
@@ -10822,6 +11233,7 @@
                 </w:p>
                 <w:p>
                   <w:pPr>
+                    <w:keepNext/>
                     <w:spacing w:after="0"/>
                   </w:pPr>
                   <w:r>
@@ -10836,6 +11248,7 @@
                 </w:p>
                 <w:p>
                   <w:pPr>
+                    <w:keepNext/>
                     <w:spacing w:after="0"/>
                   </w:pPr>
                   <w:r>
@@ -10850,6 +11263,7 @@
                 </w:p>
                 <w:p>
                   <w:pPr>
+                    <w:keepNext/>
                     <w:spacing w:after="0"/>
                   </w:pPr>
                   <w:r>
@@ -10871,6 +11285,7 @@
     </w:tbl>
     <w:p>
       <w:pPr>
+        <w:keepNext/>
         <w:spacing w:after="100"/>
       </w:pPr>
     </w:p>
@@ -10911,6 +11326,7 @@
           </w:tcPr>
           <w:p>
             <w:pPr>
+              <w:keepNext w:val="false"/>
               <w:spacing w:after="60"/>
             </w:pPr>
             <w:r>
@@ -10934,6 +11350,7 @@
           </w:p>
           <w:p>
             <w:pPr>
+              <w:keepNext w:val="false"/>
               <w:spacing w:after="80"/>
             </w:pPr>
             <w:r>
@@ -10942,11 +11359,12 @@
                 <w:sz w:val="21"/>
                 <w:szCs w:val="21"/>
               </w:rPr>
-              <w:t xml:space="preserve">The head of Retail-Plus asks whether spend per member fell from Q1 to Q2, and the analyst answers with the query above. What does it return, and what does it tell her?</w:t>
-            </w:r>
-          </w:p>
-          <w:p>
-            <w:pPr>
+              <w:t xml:space="preserve">The head of Retail-Plus asks whether spend per member fell from Q1 to Q2, and the analyst answers with the query above. What does the query return, and how will she read it?</w:t>
+            </w:r>
+          </w:p>
+          <w:p>
+            <w:pPr>
+              <w:keepNext w:val="false"/>
               <w:spacing w:after="40"/>
               <w:ind w:left="240"/>
             </w:pPr>
@@ -10966,11 +11384,12 @@
                 <w:sz w:val="21"/>
                 <w:szCs w:val="21"/>
               </w:rPr>
-              <w:t xml:space="preserve">1,500 and 750, so spend per member halved</w:t>
-            </w:r>
-          </w:p>
-          <w:p>
-            <w:pPr>
+              <w:t xml:space="preserve">1,500 and 750, which reads as spend per member halved</w:t>
+            </w:r>
+          </w:p>
+          <w:p>
+            <w:pPr>
+              <w:keepNext w:val="false"/>
               <w:spacing w:after="40"/>
               <w:ind w:left="240"/>
             </w:pPr>
@@ -10990,11 +11409,12 @@
                 <w:sz w:val="21"/>
                 <w:szCs w:val="21"/>
               </w:rPr>
-              <w:t xml:space="preserve">1,500 and 1,000, so spend per member fell by a third</w:t>
-            </w:r>
-          </w:p>
-          <w:p>
-            <w:pPr>
+              <w:t xml:space="preserve">1,500 and 1,000, which reads as spend per member down by a third</w:t>
+            </w:r>
+          </w:p>
+          <w:p>
+            <w:pPr>
+              <w:keepNext w:val="false"/>
               <w:spacing w:after="40"/>
               <w:ind w:left="240"/>
             </w:pPr>
@@ -11014,11 +11434,12 @@
                 <w:sz w:val="21"/>
                 <w:szCs w:val="21"/>
               </w:rPr>
-              <w:t xml:space="preserve">1,500 and 1,500, so spend per member held flat</w:t>
-            </w:r>
-          </w:p>
-          <w:p>
-            <w:pPr>
+              <w:t xml:space="preserve">1,500 and 1,500, which reads as flat spend per member</w:t>
+            </w:r>
+          </w:p>
+          <w:p>
+            <w:pPr>
+              <w:keepNext w:val="false"/>
               <w:spacing w:after="40"/>
               <w:ind w:left="240"/>
             </w:pPr>
@@ -11038,7 +11459,7 @@
                 <w:sz w:val="21"/>
                 <w:szCs w:val="21"/>
               </w:rPr>
-              <w:t xml:space="preserve">1,500 and NULL, so Q2 has no average to report</w:t>
+              <w:t xml:space="preserve">1,500 and NULL, which reads as no Q2 figure at all</w:t>
             </w:r>
           </w:p>
         </w:tc>
@@ -11046,6 +11467,7 @@
     </w:tbl>
     <w:p>
       <w:pPr>
+        <w:keepNext w:val="false"/>
         <w:spacing w:after="100"/>
       </w:pPr>
     </w:p>
@@ -11087,6 +11509,7 @@
           </w:tcPr>
           <w:p>
             <w:pPr>
+              <w:keepNext/>
               <w:spacing w:after="80"/>
             </w:pPr>
             <w:r>
@@ -11148,6 +11571,7 @@
                 </w:tcPr>
                 <w:p>
                   <w:pPr>
+                    <w:keepNext/>
                     <w:spacing w:after="0"/>
                   </w:pPr>
                   <w:r>
@@ -11162,6 +11586,7 @@
                 </w:p>
                 <w:p>
                   <w:pPr>
+                    <w:keepNext/>
                     <w:spacing w:after="0"/>
                   </w:pPr>
                   <w:r>
@@ -11176,6 +11601,7 @@
                 </w:p>
                 <w:p>
                   <w:pPr>
+                    <w:keepNext/>
                     <w:spacing w:after="0"/>
                   </w:pPr>
                   <w:r>
@@ -11190,6 +11616,7 @@
                 </w:p>
                 <w:p>
                   <w:pPr>
+                    <w:keepNext/>
                     <w:spacing w:after="0"/>
                   </w:pPr>
                   <w:r>
@@ -11204,6 +11631,7 @@
                 </w:p>
                 <w:p>
                   <w:pPr>
+                    <w:keepNext/>
                     <w:spacing w:after="0"/>
                   </w:pPr>
                   <w:r>
@@ -11218,6 +11646,7 @@
                 </w:p>
                 <w:p>
                   <w:pPr>
+                    <w:keepNext/>
                     <w:spacing w:after="0"/>
                   </w:pPr>
                   <w:r>
@@ -11232,6 +11661,7 @@
                 </w:p>
                 <w:p>
                   <w:pPr>
+                    <w:keepNext/>
                     <w:spacing w:after="0"/>
                   </w:pPr>
                   <w:r>
@@ -11246,6 +11676,7 @@
                 </w:p>
                 <w:p>
                   <w:pPr>
+                    <w:keepNext/>
                     <w:spacing w:after="0"/>
                   </w:pPr>
                   <w:r>
@@ -11260,6 +11691,7 @@
                 </w:p>
                 <w:p>
                   <w:pPr>
+                    <w:keepNext/>
                     <w:spacing w:after="0"/>
                   </w:pPr>
                   <w:r>
@@ -11281,6 +11713,7 @@
     </w:tbl>
     <w:p>
       <w:pPr>
+        <w:keepNext/>
         <w:spacing w:after="100"/>
       </w:pPr>
     </w:p>
@@ -11321,6 +11754,7 @@
           </w:tcPr>
           <w:p>
             <w:pPr>
+              <w:keepNext w:val="false"/>
               <w:spacing w:after="60"/>
             </w:pPr>
             <w:r>
@@ -11344,6 +11778,7 @@
           </w:p>
           <w:p>
             <w:pPr>
+              <w:keepNext w:val="false"/>
               <w:spacing w:after="80"/>
             </w:pPr>
             <w:r>
@@ -11357,6 +11792,7 @@
           </w:p>
           <w:p>
             <w:pPr>
+              <w:keepNext w:val="false"/>
               <w:spacing w:after="40"/>
               <w:ind w:left="240"/>
             </w:pPr>
@@ -11381,6 +11817,7 @@
           </w:p>
           <w:p>
             <w:pPr>
+              <w:keepNext w:val="false"/>
               <w:spacing w:after="40"/>
               <w:ind w:left="240"/>
             </w:pPr>
@@ -11405,6 +11842,7 @@
           </w:p>
           <w:p>
             <w:pPr>
+              <w:keepNext w:val="false"/>
               <w:spacing w:after="40"/>
               <w:ind w:left="240"/>
             </w:pPr>
@@ -11429,6 +11867,7 @@
           </w:p>
           <w:p>
             <w:pPr>
+              <w:keepNext w:val="false"/>
               <w:spacing w:after="40"/>
               <w:ind w:left="240"/>
             </w:pPr>
@@ -11456,6 +11895,7 @@
     </w:tbl>
     <w:p>
       <w:pPr>
+        <w:keepNext w:val="false"/>
         <w:spacing w:after="100"/>
       </w:pPr>
     </w:p>
@@ -11497,6 +11937,7 @@
           </w:tcPr>
           <w:p>
             <w:pPr>
+              <w:keepNext/>
               <w:spacing w:after="80"/>
             </w:pPr>
             <w:r>
@@ -11558,6 +11999,7 @@
                 </w:tcPr>
                 <w:p>
                   <w:pPr>
+                    <w:keepNext/>
                     <w:spacing w:after="0"/>
                   </w:pPr>
                   <w:r>
@@ -11572,6 +12014,7 @@
                 </w:p>
                 <w:p>
                   <w:pPr>
+                    <w:keepNext/>
                     <w:spacing w:after="0"/>
                   </w:pPr>
                   <w:r>
@@ -11586,6 +12029,7 @@
                 </w:p>
                 <w:p>
                   <w:pPr>
+                    <w:keepNext/>
                     <w:spacing w:after="0"/>
                   </w:pPr>
                   <w:r>
@@ -11600,6 +12044,7 @@
                 </w:p>
                 <w:p>
                   <w:pPr>
+                    <w:keepNext/>
                     <w:spacing w:after="0"/>
                   </w:pPr>
                   <w:r>
@@ -11614,6 +12059,7 @@
                 </w:p>
                 <w:p>
                   <w:pPr>
+                    <w:keepNext/>
                     <w:spacing w:after="0"/>
                   </w:pPr>
                   <w:r>
@@ -11628,6 +12074,7 @@
                 </w:p>
                 <w:p>
                   <w:pPr>
+                    <w:keepNext/>
                     <w:spacing w:after="0"/>
                   </w:pPr>
                   <w:r>
@@ -11642,6 +12089,7 @@
                 </w:p>
                 <w:p>
                   <w:pPr>
+                    <w:keepNext/>
                     <w:spacing w:after="0"/>
                   </w:pPr>
                   <w:r>
@@ -11656,6 +12104,7 @@
                 </w:p>
                 <w:p>
                   <w:pPr>
+                    <w:keepNext/>
                     <w:spacing w:after="0"/>
                   </w:pPr>
                   <w:r>
@@ -11670,6 +12119,7 @@
                 </w:p>
                 <w:p>
                   <w:pPr>
+                    <w:keepNext/>
                     <w:spacing w:after="0"/>
                   </w:pPr>
                   <w:r>
@@ -11684,6 +12134,7 @@
                 </w:p>
                 <w:p>
                   <w:pPr>
+                    <w:keepNext/>
                     <w:spacing w:after="0"/>
                   </w:pPr>
                   <w:r>
@@ -11705,6 +12156,7 @@
     </w:tbl>
     <w:p>
       <w:pPr>
+        <w:keepNext/>
         <w:spacing w:after="100"/>
       </w:pPr>
     </w:p>
@@ -11745,6 +12197,7 @@
           </w:tcPr>
           <w:p>
             <w:pPr>
+              <w:keepNext w:val="false"/>
               <w:spacing w:after="60"/>
             </w:pPr>
             <w:r>
@@ -11768,6 +12221,7 @@
           </w:p>
           <w:p>
             <w:pPr>
+              <w:keepNext w:val="false"/>
               <w:spacing w:after="80"/>
             </w:pPr>
             <w:r>
@@ -11781,6 +12235,7 @@
           </w:p>
           <w:p>
             <w:pPr>
+              <w:keepNext w:val="false"/>
               <w:spacing w:after="40"/>
               <w:ind w:left="240"/>
             </w:pPr>
@@ -11805,6 +12260,7 @@
           </w:p>
           <w:p>
             <w:pPr>
+              <w:keepNext w:val="false"/>
               <w:spacing w:after="40"/>
               <w:ind w:left="240"/>
             </w:pPr>
@@ -11829,6 +12285,7 @@
           </w:p>
           <w:p>
             <w:pPr>
+              <w:keepNext w:val="false"/>
               <w:spacing w:after="40"/>
               <w:ind w:left="240"/>
             </w:pPr>
@@ -11853,6 +12310,7 @@
           </w:p>
           <w:p>
             <w:pPr>
+              <w:keepNext w:val="false"/>
               <w:spacing w:after="40"/>
               <w:ind w:left="240"/>
             </w:pPr>
@@ -11880,6 +12338,7 @@
     </w:tbl>
     <w:p>
       <w:pPr>
+        <w:keepNext w:val="false"/>
         <w:spacing w:after="100"/>
       </w:pPr>
     </w:p>
@@ -11920,6 +12379,7 @@
           </w:tcPr>
           <w:p>
             <w:pPr>
+              <w:keepNext w:val="false"/>
               <w:spacing w:after="60"/>
             </w:pPr>
             <w:r>
@@ -11943,6 +12403,7 @@
           </w:p>
           <w:p>
             <w:pPr>
+              <w:keepNext w:val="false"/>
               <w:spacing w:after="80"/>
             </w:pPr>
             <w:r>
@@ -11956,6 +12417,7 @@
           </w:p>
           <w:p>
             <w:pPr>
+              <w:keepNext w:val="false"/>
               <w:spacing w:after="40"/>
               <w:ind w:left="240"/>
             </w:pPr>
@@ -11980,6 +12442,7 @@
           </w:p>
           <w:p>
             <w:pPr>
+              <w:keepNext w:val="false"/>
               <w:spacing w:after="40"/>
               <w:ind w:left="240"/>
             </w:pPr>
@@ -12004,6 +12467,7 @@
           </w:p>
           <w:p>
             <w:pPr>
+              <w:keepNext w:val="false"/>
               <w:spacing w:after="40"/>
               <w:ind w:left="240"/>
             </w:pPr>
@@ -12028,6 +12492,7 @@
           </w:p>
           <w:p>
             <w:pPr>
+              <w:keepNext w:val="false"/>
               <w:spacing w:after="40"/>
               <w:ind w:left="240"/>
             </w:pPr>
@@ -12070,6 +12535,7 @@
     </w:p>
     <w:p>
       <w:pPr>
+        <w:keepNext w:val="false"/>
         <w:spacing w:after="160"/>
       </w:pPr>
       <w:r>
@@ -12118,6 +12584,7 @@
           </w:tcPr>
           <w:p>
             <w:pPr>
+              <w:keepNext w:val="false"/>
               <w:spacing w:after="80"/>
             </w:pPr>
             <w:r>
@@ -12133,6 +12600,7 @@
           </w:p>
           <w:p>
             <w:pPr>
+              <w:keepNext w:val="false"/>
               <w:spacing w:after="80"/>
             </w:pPr>
             <w:r>
@@ -12146,6 +12614,7 @@
           </w:p>
           <w:p>
             <w:pPr>
+              <w:keepNext w:val="false"/>
               <w:spacing w:after="1400"/>
             </w:pPr>
             <w:r>
@@ -12162,6 +12631,7 @@
     </w:tbl>
     <w:p>
       <w:pPr>
+        <w:keepNext w:val="false"/>
         <w:spacing w:after="100"/>
       </w:pPr>
     </w:p>
@@ -12202,6 +12672,7 @@
           </w:tcPr>
           <w:p>
             <w:pPr>
+              <w:keepNext w:val="false"/>
               <w:spacing w:after="80"/>
             </w:pPr>
             <w:r>
@@ -12217,6 +12688,7 @@
           </w:p>
           <w:p>
             <w:pPr>
+              <w:keepNext w:val="false"/>
               <w:spacing w:after="80"/>
             </w:pPr>
             <w:r>
@@ -12230,6 +12702,7 @@
           </w:p>
           <w:p>
             <w:pPr>
+              <w:keepNext w:val="false"/>
               <w:spacing w:after="1400"/>
             </w:pPr>
             <w:r>
@@ -12246,6 +12719,7 @@
     </w:tbl>
     <w:p>
       <w:pPr>
+        <w:keepNext w:val="false"/>
         <w:spacing w:after="100"/>
       </w:pPr>
     </w:p>
@@ -12286,6 +12760,7 @@
           </w:tcPr>
           <w:p>
             <w:pPr>
+              <w:keepNext w:val="false"/>
               <w:spacing w:after="80"/>
             </w:pPr>
             <w:r>
@@ -12301,6 +12776,7 @@
           </w:p>
           <w:p>
             <w:pPr>
+              <w:keepNext w:val="false"/>
               <w:spacing w:after="80"/>
             </w:pPr>
             <w:r>
@@ -12314,6 +12790,7 @@
           </w:p>
           <w:p>
             <w:pPr>
+              <w:keepNext w:val="false"/>
               <w:spacing w:after="1400"/>
             </w:pPr>
             <w:r>
@@ -12330,6 +12807,7 @@
     </w:tbl>
     <w:p>
       <w:pPr>
+        <w:keepNext w:val="false"/>
         <w:spacing w:after="100"/>
       </w:pPr>
     </w:p>
@@ -12370,6 +12848,7 @@
           </w:tcPr>
           <w:p>
             <w:pPr>
+              <w:keepNext w:val="false"/>
               <w:spacing w:after="80"/>
             </w:pPr>
             <w:r>
@@ -12385,6 +12864,7 @@
           </w:p>
           <w:p>
             <w:pPr>
+              <w:keepNext w:val="false"/>
               <w:spacing w:after="80"/>
             </w:pPr>
             <w:r>
@@ -12398,6 +12878,7 @@
           </w:p>
           <w:p>
             <w:pPr>
+              <w:keepNext w:val="false"/>
               <w:spacing w:after="1400"/>
             </w:pPr>
             <w:r>
@@ -12414,6 +12895,7 @@
     </w:tbl>
     <w:p>
       <w:pPr>
+        <w:keepNext w:val="false"/>
         <w:spacing w:after="100"/>
       </w:pPr>
     </w:p>
@@ -12454,6 +12936,7 @@
           </w:tcPr>
           <w:p>
             <w:pPr>
+              <w:keepNext w:val="false"/>
               <w:spacing w:after="80"/>
             </w:pPr>
             <w:r>
@@ -12469,6 +12952,7 @@
           </w:p>
           <w:p>
             <w:pPr>
+              <w:keepNext w:val="false"/>
               <w:spacing w:after="80"/>
             </w:pPr>
             <w:r>
@@ -12482,6 +12966,7 @@
           </w:p>
           <w:p>
             <w:pPr>
+              <w:keepNext w:val="false"/>
               <w:spacing w:after="80"/>
             </w:pPr>
             <w:r>
@@ -12506,6 +12991,7 @@
     </w:tbl>
     <w:p>
       <w:pPr>
+        <w:keepNext w:val="false"/>
         <w:spacing w:after="100"/>
       </w:pPr>
     </w:p>
@@ -12546,6 +13032,7 @@
           </w:tcPr>
           <w:p>
             <w:pPr>
+              <w:keepNext w:val="false"/>
               <w:spacing w:after="80"/>
             </w:pPr>
             <w:r>
@@ -12561,6 +13048,7 @@
           </w:p>
           <w:p>
             <w:pPr>
+              <w:keepNext w:val="false"/>
               <w:spacing w:after="80"/>
             </w:pPr>
             <w:r>
@@ -12574,6 +13062,7 @@
           </w:p>
           <w:p>
             <w:pPr>
+              <w:keepNext w:val="false"/>
               <w:spacing w:after="80"/>
             </w:pPr>
             <w:r>
@@ -12598,6 +13087,7 @@
     </w:tbl>
     <w:p>
       <w:pPr>
+        <w:keepNext w:val="false"/>
         <w:spacing w:after="100"/>
       </w:pPr>
     </w:p>
@@ -12638,6 +13128,7 @@
           </w:tcPr>
           <w:p>
             <w:pPr>
+              <w:keepNext w:val="false"/>
               <w:spacing w:after="80"/>
             </w:pPr>
             <w:r>
@@ -12653,6 +13144,7 @@
           </w:p>
           <w:p>
             <w:pPr>
+              <w:keepNext w:val="false"/>
               <w:spacing w:after="80"/>
             </w:pPr>
             <w:r>
@@ -12666,6 +13158,7 @@
           </w:p>
           <w:p>
             <w:pPr>
+              <w:keepNext w:val="false"/>
               <w:spacing w:after="80"/>
             </w:pPr>
             <w:r>
@@ -12690,6 +13183,7 @@
     </w:tbl>
     <w:p>
       <w:pPr>
+        <w:keepNext w:val="false"/>
         <w:spacing w:after="100"/>
       </w:pPr>
     </w:p>
@@ -12730,6 +13224,7 @@
           </w:tcPr>
           <w:p>
             <w:pPr>
+              <w:keepNext w:val="false"/>
               <w:spacing w:after="80"/>
             </w:pPr>
             <w:r>
@@ -12745,6 +13240,7 @@
           </w:p>
           <w:p>
             <w:pPr>
+              <w:keepNext w:val="false"/>
               <w:spacing w:after="80"/>
             </w:pPr>
             <w:r>
@@ -12758,6 +13254,7 @@
           </w:p>
           <w:p>
             <w:pPr>
+              <w:keepNext w:val="false"/>
               <w:spacing w:after="80"/>
             </w:pPr>
             <w:r>
@@ -12782,6 +13279,7 @@
     </w:tbl>
     <w:p>
       <w:pPr>
+        <w:keepNext w:val="false"/>
         <w:spacing w:after="100"/>
       </w:pPr>
     </w:p>
@@ -12822,6 +13320,7 @@
           </w:tcPr>
           <w:p>
             <w:pPr>
+              <w:keepNext w:val="false"/>
               <w:spacing w:after="80"/>
             </w:pPr>
             <w:r>
@@ -12837,6 +13336,7 @@
           </w:p>
           <w:p>
             <w:pPr>
+              <w:keepNext w:val="false"/>
               <w:spacing w:after="80"/>
             </w:pPr>
             <w:r>
@@ -12850,6 +13350,7 @@
           </w:p>
           <w:p>
             <w:pPr>
+              <w:keepNext w:val="false"/>
               <w:spacing w:after="80"/>
             </w:pPr>
             <w:r>
@@ -12874,6 +13375,7 @@
     </w:tbl>
     <w:p>
       <w:pPr>
+        <w:keepNext w:val="false"/>
         <w:spacing w:after="100"/>
       </w:pPr>
     </w:p>
@@ -12914,6 +13416,7 @@
           </w:tcPr>
           <w:p>
             <w:pPr>
+              <w:keepNext w:val="false"/>
               <w:spacing w:after="80"/>
             </w:pPr>
             <w:r>
@@ -12929,6 +13432,7 @@
           </w:p>
           <w:p>
             <w:pPr>
+              <w:keepNext w:val="false"/>
               <w:spacing w:after="80"/>
             </w:pPr>
             <w:r>
@@ -12942,6 +13446,7 @@
           </w:p>
           <w:p>
             <w:pPr>
+              <w:keepNext w:val="false"/>
               <w:spacing w:after="80"/>
             </w:pPr>
             <w:r>
@@ -12981,6 +13486,7 @@
     </w:p>
     <w:p>
       <w:pPr>
+        <w:keepNext w:val="false"/>
         <w:spacing w:after="80"/>
       </w:pPr>
       <w:r>
@@ -13032,6 +13538,7 @@
           </w:tcPr>
           <w:p>
             <w:pPr>
+              <w:keepNext w:val="false"/>
               <w:spacing w:after="80"/>
             </w:pPr>
             <w:r>
@@ -13065,6 +13572,7 @@
           </w:tcPr>
           <w:p>
             <w:pPr>
+              <w:keepNext w:val="false"/>
               <w:spacing w:after="80"/>
             </w:pPr>
             <w:r>
@@ -13098,6 +13606,7 @@
           </w:tcPr>
           <w:p>
             <w:pPr>
+              <w:keepNext w:val="false"/>
               <w:spacing w:after="80"/>
             </w:pPr>
             <w:r>
@@ -13132,6 +13641,7 @@
           </w:tcPr>
           <w:p>
             <w:pPr>
+              <w:keepNext w:val="false"/>
               <w:spacing w:after="80"/>
             </w:pPr>
             <w:r>
@@ -13162,6 +13672,7 @@
           </w:tcPr>
           <w:p>
             <w:pPr>
+              <w:keepNext w:val="false"/>
               <w:spacing w:after="80"/>
             </w:pPr>
             <w:r>
@@ -13192,6 +13703,7 @@
           </w:tcPr>
           <w:p>
             <w:pPr>
+              <w:keepNext w:val="false"/>
               <w:spacing w:after="80"/>
             </w:pPr>
             <w:r>
@@ -13208,6 +13720,7 @@
     </w:tbl>
     <w:p>
       <w:pPr>
+        <w:keepNext w:val="false"/>
         <w:spacing w:after="160"/>
       </w:pPr>
     </w:p>

</xml_diff>

<commit_message>
Week 2 Saturday v3: Q13's options name the rule and the note, never the counts Q12 asks for
Q13's options printed 52, 50, 49 and 51 beside each rule, which answered Q12 on the same page. They
now name the rule and what its note says, so Q12 is worked from the table and Q13 tests the choice.

Co-Authored-By: Claude Opus 5.5 <noreply@anthropic.com>
Claude-Session: https://claude.ai/code/session_01P7zaoR4dQ5pzBFnsX549JQ
</commit_message>
<xml_diff>
--- a/content/W02/SAT/paper/C2_W02_SAT_recap_paper_STUDENT.docx
+++ b/content/W02/SAT/paper/C2_W02_SAT_recap_paper_STUDENT.docx
@@ -9623,7 +9623,7 @@
                 <w:sz w:val="20"/>
                 <w:szCs w:val="20"/>
               </w:rPr>
-              <w:t xml:space="preserve">DENSE_RANK: 52 members, since it ranks ties the same and leaves no gaps</w:t>
+              <w:t xml:space="preserve">DENSE_RANK, since it ranks tied members the same and leaves no gaps in the list</w:t>
             </w:r>
           </w:p>
           <w:p>
@@ -9651,7 +9651,7 @@
                 <w:sz w:val="20"/>
                 <w:szCs w:val="20"/>
               </w:rPr>
-              <w:t xml:space="preserve">ROW_NUMBER by member id: 50 members, dropping C-0242 because its id sorts later</w:t>
+              <w:t xml:space="preserve">ROW_NUMBER by member id, dropping C-0242 because its id sorts after C-0185</w:t>
             </w:r>
           </w:p>
           <w:p>
@@ -9679,7 +9679,7 @@
                 <w:sz w:val="20"/>
                 <w:szCs w:val="20"/>
               </w:rPr>
-              <w:t xml:space="preserve">Whole ties only: 49 members, leaving both tied members off the list</w:t>
+              <w:t xml:space="preserve">Whole ties only, leaving both members tied at the line off the list</w:t>
             </w:r>
           </w:p>
           <w:p>
@@ -9707,7 +9707,7 @@
                 <w:sz w:val="20"/>
                 <w:szCs w:val="20"/>
               </w:rPr>
-              <w:t xml:space="preserve">RANK: 51 members, saying that C-0185 and C-0242 tie at fiftieth on Rs 3,350</w:t>
+              <w:t xml:space="preserve">RANK, with a note naming C-0185 and C-0242 as tied at fiftieth on Rs 3,350</w:t>
             </w:r>
           </w:p>
         </w:tc>

</xml_diff>